<commit_message>
Ajout document de planification
</commit_message>
<xml_diff>
--- a/doc/C61_-_Document de conception_L_Attaque.docx
+++ b/doc/C61_-_Document de conception_L_Attaque.docx
@@ -1,6 +1,6 @@
 
 <file path=word/document.xml><?xml version="1.0" encoding="utf-8"?>
-<w:document xmlns:wpc="http://schemas.microsoft.com/office/word/2010/wordprocessingCanvas" xmlns:cx="http://schemas.microsoft.com/office/drawing/2014/chartex" xmlns:cx1="http://schemas.microsoft.com/office/drawing/2015/9/8/chartex" xmlns:cx2="http://schemas.microsoft.com/office/drawing/2015/10/21/chartex" xmlns:cx3="http://schemas.microsoft.com/office/drawing/2016/5/9/chartex" xmlns:cx4="http://schemas.microsoft.com/office/drawing/2016/5/10/chartex" xmlns:cx5="http://schemas.microsoft.com/office/drawing/2016/5/11/chartex" xmlns:cx6="http://schemas.microsoft.com/office/drawing/2016/5/12/chartex" xmlns:cx7="http://schemas.microsoft.com/office/drawing/2016/5/13/chartex" xmlns:cx8="http://schemas.microsoft.com/office/drawing/2016/5/14/chartex" xmlns:mc="http://schemas.openxmlformats.org/markup-compatibility/2006" xmlns:aink="http://schemas.microsoft.com/office/drawing/2016/ink" xmlns:am3d="http://schemas.microsoft.com/office/drawing/2017/model3d" xmlns:o="urn:schemas-microsoft-com:office:office" xmlns:oel="http://schemas.microsoft.com/office/2019/extlst" xmlns:r="http://schemas.openxmlformats.org/officeDocument/2006/relationships" xmlns:m="http://schemas.openxmlformats.org/officeDocument/2006/math" xmlns:v="urn:schemas-microsoft-com:vml" xmlns:wp14="http://schemas.microsoft.com/office/word/2010/wordprocessingDrawing" xmlns:wp="http://schemas.openxmlformats.org/drawingml/2006/wordprocessingDrawing" xmlns:w10="urn:schemas-microsoft-com:office:word" xmlns:w="http://schemas.openxmlformats.org/wordprocessingml/2006/main" xmlns:w14="http://schemas.microsoft.com/office/word/2010/wordml" xmlns:w15="http://schemas.microsoft.com/office/word/2012/wordml" xmlns:w16cex="http://schemas.microsoft.com/office/word/2018/wordml/cex" xmlns:w16cid="http://schemas.microsoft.com/office/word/2016/wordml/cid" xmlns:w16="http://schemas.microsoft.com/office/word/2018/wordml" xmlns:w16du="http://schemas.microsoft.com/office/word/2023/wordml/word16du" xmlns:w16sdtdh="http://schemas.microsoft.com/office/word/2020/wordml/sdtdatahash" xmlns:w16sdtfl="http://schemas.microsoft.com/office/word/2024/wordml/sdtformatlock" xmlns:w16se="http://schemas.microsoft.com/office/word/2015/wordml/symex" xmlns:wpg="http://schemas.microsoft.com/office/word/2010/wordprocessingGroup" xmlns:wpi="http://schemas.microsoft.com/office/word/2010/wordprocessingInk" xmlns:wne="http://schemas.microsoft.com/office/word/2006/wordml" xmlns:wps="http://schemas.microsoft.com/office/word/2010/wordprocessingShape" mc:Ignorable="w14 w15 w16se w16cid w16 w16cex w16sdtdh w16sdtfl w16du wp14">
+<w:document xmlns:wpc="http://schemas.microsoft.com/office/word/2010/wordprocessingCanvas" xmlns:cx="http://schemas.microsoft.com/office/drawing/2014/chartex" xmlns:cx1="http://schemas.microsoft.com/office/drawing/2015/9/8/chartex" xmlns:cx2="http://schemas.microsoft.com/office/drawing/2015/10/21/chartex" xmlns:cx3="http://schemas.microsoft.com/office/drawing/2016/5/9/chartex" xmlns:cx4="http://schemas.microsoft.com/office/drawing/2016/5/10/chartex" xmlns:cx5="http://schemas.microsoft.com/office/drawing/2016/5/11/chartex" xmlns:cx6="http://schemas.microsoft.com/office/drawing/2016/5/12/chartex" xmlns:cx7="http://schemas.microsoft.com/office/drawing/2016/5/13/chartex" xmlns:cx8="http://schemas.microsoft.com/office/drawing/2016/5/14/chartex" xmlns:mc="http://schemas.openxmlformats.org/markup-compatibility/2006" xmlns:aink="http://schemas.microsoft.com/office/drawing/2016/ink" xmlns:am3d="http://schemas.microsoft.com/office/drawing/2017/model3d" xmlns:o="urn:schemas-microsoft-com:office:office" xmlns:r="http://schemas.openxmlformats.org/officeDocument/2006/relationships" xmlns:m="http://schemas.openxmlformats.org/officeDocument/2006/math" xmlns:v="urn:schemas-microsoft-com:vml" xmlns:wp14="http://schemas.microsoft.com/office/word/2010/wordprocessingDrawing" xmlns:wp="http://schemas.openxmlformats.org/drawingml/2006/wordprocessingDrawing" xmlns:w10="urn:schemas-microsoft-com:office:word" xmlns:w="http://schemas.openxmlformats.org/wordprocessingml/2006/main" xmlns:w14="http://schemas.microsoft.com/office/word/2010/wordml" xmlns:w15="http://schemas.microsoft.com/office/word/2012/wordml" xmlns:w16cid="http://schemas.microsoft.com/office/word/2016/wordml/cid" xmlns:w16se="http://schemas.microsoft.com/office/word/2015/wordml/symex" xmlns:wpg="http://schemas.microsoft.com/office/word/2010/wordprocessingGroup" xmlns:wpi="http://schemas.microsoft.com/office/word/2010/wordprocessingInk" xmlns:wne="http://schemas.microsoft.com/office/word/2006/wordml" xmlns:wps="http://schemas.microsoft.com/office/word/2010/wordprocessingShape" mc:Ignorable="w14 w15 w16se w16cid wp14">
   <w:body>
     <w:p>
       <w:pPr>
@@ -216,9 +216,6 @@
         <w:t>L</w:t>
       </w:r>
       <w:r>
-        <w:rPr>
-          <w:rFonts w:hint="eastAsia"/>
-        </w:rPr>
         <w:t>’</w:t>
       </w:r>
       <w:r>
@@ -1516,53 +1513,6 @@
     </w:p>
     <w:p>
       <w:pPr>
-        <w:pStyle w:val="Titre1"/>
-      </w:pPr>
-      <w:bookmarkStart w:id="0" w:name="_Toc221873850"/>
-      <w:r>
-        <w:lastRenderedPageBreak/>
-        <w:t>Diagramme de cas d</w:t>
-      </w:r>
-      <w:r>
-        <w:t>’</w:t>
-      </w:r>
-      <w:r>
-        <w:t>usage</w:t>
-      </w:r>
-      <w:bookmarkEnd w:id="0"/>
-    </w:p>
-    <w:p>
-      <w:pPr>
-        <w:pStyle w:val="Titre1"/>
-      </w:pPr>
-      <w:bookmarkStart w:id="1" w:name="_Toc221873851"/>
-      <w:r>
-        <w:t>Diagramme de classes</w:t>
-      </w:r>
-      <w:bookmarkEnd w:id="1"/>
-    </w:p>
-    <w:p>
-      <w:pPr>
-        <w:pStyle w:val="Titre1"/>
-      </w:pPr>
-      <w:bookmarkStart w:id="2" w:name="_Toc221873852"/>
-      <w:r>
-        <w:t>Modèle relationnel</w:t>
-      </w:r>
-      <w:bookmarkEnd w:id="2"/>
-    </w:p>
-    <w:p>
-      <w:pPr>
-        <w:pStyle w:val="Titre1"/>
-      </w:pPr>
-      <w:bookmarkStart w:id="3" w:name="_Toc221873853"/>
-      <w:r>
-        <w:t>Maquettes</w:t>
-      </w:r>
-      <w:bookmarkEnd w:id="3"/>
-    </w:p>
-    <w:p>
-      <w:pPr>
         <w:rPr>
           <w:b/>
           <w:bCs/>
@@ -1587,6 +1537,52 @@
     </w:p>
     <w:p>
       <w:pPr>
+        <w:pStyle w:val="Titre1"/>
+      </w:pPr>
+      <w:bookmarkStart w:id="0" w:name="_Toc221873850"/>
+      <w:r>
+        <w:t>Diagramme de cas d</w:t>
+      </w:r>
+      <w:r>
+        <w:t>’</w:t>
+      </w:r>
+      <w:r>
+        <w:t>usage</w:t>
+      </w:r>
+      <w:bookmarkEnd w:id="0"/>
+    </w:p>
+    <w:p>
+      <w:pPr>
+        <w:pStyle w:val="Titre1"/>
+      </w:pPr>
+      <w:bookmarkStart w:id="1" w:name="_Toc221873851"/>
+      <w:r>
+        <w:t>Diagramme de classes</w:t>
+      </w:r>
+      <w:bookmarkEnd w:id="1"/>
+    </w:p>
+    <w:p>
+      <w:pPr>
+        <w:pStyle w:val="Titre1"/>
+      </w:pPr>
+      <w:bookmarkStart w:id="2" w:name="_Toc221873852"/>
+      <w:r>
+        <w:t>Modèle relationnel</w:t>
+      </w:r>
+      <w:bookmarkEnd w:id="2"/>
+    </w:p>
+    <w:p>
+      <w:pPr>
+        <w:pStyle w:val="Titre1"/>
+      </w:pPr>
+      <w:bookmarkStart w:id="3" w:name="_Toc221873853"/>
+      <w:r>
+        <w:t>Maquettes</w:t>
+      </w:r>
+      <w:bookmarkEnd w:id="3"/>
+    </w:p>
+    <w:p>
+      <w:pPr>
         <w:rPr>
           <w:b/>
           <w:bCs/>
@@ -1651,6 +1647,30 @@
     </w:p>
     <w:p>
       <w:pPr>
+        <w:rPr>
+          <w:b/>
+          <w:bCs/>
+        </w:rPr>
+      </w:pPr>
+    </w:p>
+    <w:p>
+      <w:pPr>
+        <w:rPr>
+          <w:b/>
+          <w:bCs/>
+        </w:rPr>
+      </w:pPr>
+    </w:p>
+    <w:p>
+      <w:pPr>
+        <w:rPr>
+          <w:b/>
+          <w:bCs/>
+        </w:rPr>
+      </w:pPr>
+    </w:p>
+    <w:p>
+      <w:pPr>
         <w:pStyle w:val="Titre1"/>
       </w:pPr>
       <w:bookmarkStart w:id="4" w:name="_Toc221873854"/>
@@ -1662,16 +1682,16 @@
     <w:p>
       <w:pPr>
         <w:pStyle w:val="Titre2"/>
+        <w:rPr>
+          <w:u w:val="single"/>
+        </w:rPr>
       </w:pPr>
       <w:bookmarkStart w:id="5" w:name="_Toc221873855"/>
       <w:r>
-        <w:t>Structure</w:t>
-      </w:r>
-      <w:r>
-        <w:t>s</w:t>
-      </w:r>
-      <w:r>
-        <w:t xml:space="preserve"> de données</w:t>
+        <w:rPr>
+          <w:u w:val="single"/>
+        </w:rPr>
+        <w:t>Structures de données</w:t>
       </w:r>
       <w:bookmarkEnd w:id="5"/>
     </w:p>
@@ -1694,8 +1714,23 @@
       <w:bookmarkEnd w:id="6"/>
     </w:p>
     <w:p>
-      <w:r>
-        <w:t xml:space="preserve">Nous emploierons une double liste chaînée pour conserver en mémoire l’arborescence de la recherche MCTS. Cette liste est nécessaire pour conserver les liens entre les différents nodes afin de conserver l’historique des parcours dans l’arborescence de recherche. Elle est également importante pour la rétropropagation à la fin d’une itération. </w:t>
+      <w:pPr>
+        <w:jc w:val="both"/>
+      </w:pPr>
+      <w:r>
+        <w:t xml:space="preserve">Nous emploierons une double liste chaînée pour conserver en mémoire l’arborescence de la recherche MCTS. Cette liste est nécessaire </w:t>
+      </w:r>
+      <w:r>
+        <w:t xml:space="preserve">pour maintenir les liens entre les différents </w:t>
+      </w:r>
+      <w:r>
+        <w:t>nœuds</w:t>
+      </w:r>
+      <w:r>
+        <w:t xml:space="preserve"> </w:t>
+      </w:r>
+      <w:r>
+        <w:t xml:space="preserve">afin de conserver l’historique des parcours dans l’arborescence de recherche. Elle est également importante pour la rétropropagation à la fin d’une itération. </w:t>
       </w:r>
     </w:p>
     <w:p>
@@ -1717,13 +1752,30 @@
           <w:sz w:val="28"/>
           <w:szCs w:val="28"/>
         </w:rPr>
+        <w:lastRenderedPageBreak/>
         <w:t>Dictionnaire</w:t>
       </w:r>
       <w:bookmarkEnd w:id="7"/>
     </w:p>
     <w:p>
       <w:r>
-        <w:t>Dans la classe BeliefPiece, la variable probabilities sera sous la forme d</w:t>
+        <w:t xml:space="preserve">Dans la classe </w:t>
+      </w:r>
+      <w:proofErr w:type="spellStart"/>
+      <w:r>
+        <w:t>BeliefPiece</w:t>
+      </w:r>
+      <w:proofErr w:type="spellEnd"/>
+      <w:r>
+        <w:t xml:space="preserve">, la variable </w:t>
+      </w:r>
+      <w:proofErr w:type="spellStart"/>
+      <w:r>
+        <w:t>probabilities</w:t>
+      </w:r>
+      <w:proofErr w:type="spellEnd"/>
+      <w:r>
+        <w:t xml:space="preserve"> sera sous la forme d</w:t>
       </w:r>
       <w:r>
         <w:t>’</w:t>
@@ -1750,11 +1802,21 @@
         <w:t>)</w:t>
       </w:r>
       <w:r>
-        <w:t xml:space="preserve"> et les valeurs </w:t>
-      </w:r>
-      <w:r>
-        <w:lastRenderedPageBreak/>
-        <w:t>seront de type float, comprises entre 0 et 1 et représentant la probabilité que la pièce donnée soit du type de la clé. Ce dictionnaire est intéressant dans le cadre de notre projet, puisq</w:t>
+        <w:t xml:space="preserve"> et les valeurs seront de type </w:t>
+      </w:r>
+      <w:proofErr w:type="spellStart"/>
+      <w:r>
+        <w:t>float</w:t>
+      </w:r>
+      <w:proofErr w:type="spellEnd"/>
+      <w:r>
+        <w:t xml:space="preserve">, comprises entre 0 et 1 et représentant la probabilité que la pièce donnée </w:t>
+      </w:r>
+      <w:r>
+        <w:t>corresponde au type défini par la clé</w:t>
+      </w:r>
+      <w:r>
+        <w:t>. Ce dictionnaire est intéressant dans le cadre de notre projet, puisq</w:t>
       </w:r>
       <w:r>
         <w:t>u’</w:t>
@@ -1775,7 +1837,15 @@
         <w:t>I</w:t>
       </w:r>
       <w:r>
-        <w:t xml:space="preserve">A de conserver un État de Croyance (Belief </w:t>
+        <w:t>A de conserver un État de Croyance (</w:t>
+      </w:r>
+      <w:proofErr w:type="spellStart"/>
+      <w:r>
+        <w:t>Belief</w:t>
+      </w:r>
+      <w:proofErr w:type="spellEnd"/>
+      <w:r>
+        <w:t xml:space="preserve"> </w:t>
       </w:r>
       <w:r>
         <w:t>State) persistant</w:t>
@@ -1863,7 +1933,19 @@
         <w:t>’</w:t>
       </w:r>
       <w:r>
-        <w:t xml:space="preserve">envoyer une par une les 80 pièce du jeu en les regroupant en une seule structure de donnée, évitant les transferts de données trop fréquents. </w:t>
+        <w:t>envoyer une par une les 80 pièce</w:t>
+      </w:r>
+      <w:r>
+        <w:t>s</w:t>
+      </w:r>
+      <w:r>
+        <w:t xml:space="preserve"> du jeu en les regroupant en une seule structure de donnée</w:t>
+      </w:r>
+      <w:r>
+        <w:t>s</w:t>
+      </w:r>
+      <w:r>
+        <w:t xml:space="preserve">, évitant les transferts de données trop fréquents. </w:t>
       </w:r>
     </w:p>
     <w:p>
@@ -1877,9 +1959,15 @@
     <w:p>
       <w:pPr>
         <w:pStyle w:val="Titre2"/>
+        <w:rPr>
+          <w:u w:val="single"/>
+        </w:rPr>
       </w:pPr>
       <w:bookmarkStart w:id="9" w:name="_Toc221873859"/>
       <w:r>
+        <w:rPr>
+          <w:u w:val="single"/>
+        </w:rPr>
         <w:t>Patrons de conception</w:t>
       </w:r>
       <w:bookmarkEnd w:id="9"/>
@@ -1893,147 +1981,185 @@
         </w:rPr>
       </w:pPr>
       <w:bookmarkStart w:id="10" w:name="_Toc221873860"/>
+      <w:proofErr w:type="spellStart"/>
       <w:r>
         <w:rPr>
           <w:sz w:val="28"/>
           <w:szCs w:val="28"/>
         </w:rPr>
-        <w:t>Factory Pattern</w:t>
-      </w:r>
-      <w:bookmarkEnd w:id="10"/>
-    </w:p>
-    <w:p>
-      <w:r>
-        <w:t>Ce patron</w:t>
-      </w:r>
-      <w:r>
-        <w:t xml:space="preserve"> de conception permet </w:t>
-      </w:r>
-      <w:r>
-        <w:t>d’</w:t>
-      </w:r>
-      <w:r>
-        <w:t xml:space="preserve">ajouter facilement différents thèmes graphiques aux pièces sans avoir à coder 12 classes de façon indépendante. Il permet de réduire la complexité du code (moins </w:t>
-      </w:r>
-      <w:r>
-        <w:t>d’if</w:t>
-      </w:r>
-      <w:r>
-        <w:rPr>
-          <w:rFonts w:hint="eastAsia"/>
-        </w:rPr>
-        <w:t>…</w:t>
-      </w:r>
-      <w:r>
-        <w:t>e</w:t>
-      </w:r>
-      <w:r>
-        <w:t>lse) en centralisant la logique commune dans une fonction usine. Il permet donc de séparer la logique de l</w:t>
-      </w:r>
-      <w:r>
-        <w:t>’</w:t>
-      </w:r>
-      <w:r>
-        <w:t xml:space="preserve">apparence des pièces, ce qui est intéressant dans un jeu où les pièces ont différentes apparences, mais des logiques similaires. </w:t>
-      </w:r>
-    </w:p>
-    <w:p>
-      <w:pPr>
-        <w:pStyle w:val="Titre3"/>
+        <w:t>Factory</w:t>
+      </w:r>
+      <w:proofErr w:type="spellEnd"/>
+      <w:r>
         <w:rPr>
           <w:sz w:val="28"/>
           <w:szCs w:val="28"/>
         </w:rPr>
-      </w:pPr>
-      <w:bookmarkStart w:id="11" w:name="_Toc221873861"/>
-      <w:r>
+        <w:t xml:space="preserve"> Pattern</w:t>
+      </w:r>
+      <w:bookmarkEnd w:id="10"/>
+    </w:p>
+    <w:p>
+      <w:pPr>
+        <w:jc w:val="both"/>
+      </w:pPr>
+      <w:r>
+        <w:t>Ce patron</w:t>
+      </w:r>
+      <w:r>
+        <w:t xml:space="preserve"> de conception permet </w:t>
+      </w:r>
+      <w:r>
+        <w:t>d’</w:t>
+      </w:r>
+      <w:r>
+        <w:t>ajouter facilement différents thèmes graphiques aux pièces sans avoir à coder 12 classes de façon indépendante. Il permet de réduire la complexité du code (</w:t>
+      </w:r>
+      <w:r>
+        <w:t>réduire les branchements conditionnels</w:t>
+      </w:r>
+      <w:r>
+        <w:t>)</w:t>
+      </w:r>
+      <w:r>
+        <w:t xml:space="preserve"> </w:t>
+      </w:r>
+      <w:r>
+        <w:t>en centralisant la logique commune dans une fonction usine. Il permet donc de séparer la logique de l</w:t>
+      </w:r>
+      <w:r>
+        <w:t>’</w:t>
+      </w:r>
+      <w:r>
+        <w:t xml:space="preserve">apparence des pièces, ce qui est intéressant dans un jeu où les pièces ont différentes apparences, mais des logiques similaires. </w:t>
+      </w:r>
+    </w:p>
+    <w:p>
+      <w:pPr>
+        <w:pStyle w:val="Titre3"/>
         <w:rPr>
           <w:sz w:val="28"/>
           <w:szCs w:val="28"/>
         </w:rPr>
-        <w:t>Observer</w:t>
-      </w:r>
-      <w:bookmarkEnd w:id="11"/>
-    </w:p>
-    <w:p>
-      <w:pPr>
-        <w:rPr>
-          <w:rFonts w:ascii="Times New Roman" w:hAnsi="Times New Roman"/>
-        </w:rPr>
-      </w:pPr>
-      <w:r>
-        <w:t>L</w:t>
-      </w:r>
-      <w:r>
-        <w:t>’</w:t>
-      </w:r>
-      <w:r>
-        <w:t xml:space="preserve">utilisation de useEffect dans le cadre du changement de tour de jeu correspond à un patron Observer. </w:t>
-      </w:r>
-      <w:r>
-        <w:t>Après un mouvement validé de la part d</w:t>
-      </w:r>
-      <w:r>
-        <w:t>’</w:t>
-      </w:r>
-      <w:r>
-        <w:t>un joueur, le serveur notifie les joueurs du changement de tour</w:t>
-      </w:r>
-      <w:r>
-        <w:t>. La variable qui contient le tour en cours correspond au sujet observé du patron et notifie</w:t>
-      </w:r>
-      <w:r>
-        <w:t xml:space="preserve"> </w:t>
-      </w:r>
-      <w:r>
-        <w:t xml:space="preserve">le useEffect qui a cette variable comme dépendance. Celui-ci est abonné à ce sujet. Il effectue une comparaison avec la valeur précédente; si elle a </w:t>
-      </w:r>
-      <w:r>
-        <w:rPr>
-          <w:rFonts w:hint="eastAsia"/>
-        </w:rPr>
-        <w:t>chang</w:t>
-      </w:r>
-      <w:r>
-        <w:t>é, la comp</w:t>
-      </w:r>
-      <w:r>
-        <w:t>osante entière est rafraîchie. Ce processus s</w:t>
-      </w:r>
-      <w:r>
-        <w:t>’</w:t>
-      </w:r>
-      <w:r>
-        <w:t xml:space="preserve">effectue de manière automatique et non pas impérative. </w:t>
-      </w:r>
-    </w:p>
-    <w:p>
-      <w:pPr>
-        <w:ind w:left="708"/>
-      </w:pPr>
-    </w:p>
-    <w:p>
-      <w:pPr>
-        <w:pStyle w:val="Titre3"/>
+      </w:pPr>
+      <w:bookmarkStart w:id="11" w:name="_Toc221873861"/>
+      <w:r>
         <w:rPr>
           <w:sz w:val="28"/>
           <w:szCs w:val="28"/>
         </w:rPr>
-      </w:pPr>
-      <w:bookmarkStart w:id="12" w:name="_Toc221873862"/>
-      <w:r>
+        <w:t>Observer</w:t>
+      </w:r>
+      <w:bookmarkEnd w:id="11"/>
+    </w:p>
+    <w:p>
+      <w:pPr>
+        <w:jc w:val="both"/>
+        <w:rPr>
+          <w:rFonts w:ascii="Times New Roman" w:hAnsi="Times New Roman"/>
+        </w:rPr>
+      </w:pPr>
+      <w:r>
+        <w:t>L</w:t>
+      </w:r>
+      <w:r>
+        <w:t>’</w:t>
+      </w:r>
+      <w:r>
+        <w:t xml:space="preserve">utilisation de </w:t>
+      </w:r>
+      <w:proofErr w:type="spellStart"/>
+      <w:r>
+        <w:t>useEffect</w:t>
+      </w:r>
+      <w:proofErr w:type="spellEnd"/>
+      <w:r>
+        <w:t xml:space="preserve"> dans le cadre du changement de tour de jeu correspond à un patron Observer. </w:t>
+      </w:r>
+      <w:r>
+        <w:t>Après un mouvement validé de la part d</w:t>
+      </w:r>
+      <w:r>
+        <w:t>’</w:t>
+      </w:r>
+      <w:r>
+        <w:t>un joueur, le serveur notifie les joueurs du changement de tour</w:t>
+      </w:r>
+      <w:r>
+        <w:t>. La variable qui contient le tour en cours correspond au sujet observé du patron et notifie</w:t>
+      </w:r>
+      <w:r>
+        <w:t xml:space="preserve"> </w:t>
+      </w:r>
+      <w:r>
+        <w:t xml:space="preserve">le </w:t>
+      </w:r>
+      <w:proofErr w:type="spellStart"/>
+      <w:r>
+        <w:t>useEffect</w:t>
+      </w:r>
+      <w:proofErr w:type="spellEnd"/>
+      <w:r>
+        <w:t xml:space="preserve"> qui a cette variable comme dépendance. Celui-ci est abonné à ce sujet. Il effectue une comparaison avec la valeur précédente; si elle a </w:t>
+      </w:r>
+      <w:r>
+        <w:rPr>
+          <w:rFonts w:hint="eastAsia"/>
+        </w:rPr>
+        <w:t>chang</w:t>
+      </w:r>
+      <w:r>
+        <w:t>é, l</w:t>
+      </w:r>
+      <w:r>
+        <w:t>e</w:t>
+      </w:r>
+      <w:r>
+        <w:t xml:space="preserve"> comp</w:t>
+      </w:r>
+      <w:r>
+        <w:t>osant enti</w:t>
+      </w:r>
+      <w:r>
+        <w:t>er</w:t>
+      </w:r>
+      <w:r>
+        <w:t xml:space="preserve"> est rafraîchi. Ce processus s</w:t>
+      </w:r>
+      <w:r>
+        <w:t>’</w:t>
+      </w:r>
+      <w:r>
+        <w:t xml:space="preserve">effectue de manière automatique et non pas impérative. </w:t>
+      </w:r>
+    </w:p>
+    <w:p>
+      <w:pPr>
+        <w:ind w:left="708"/>
+      </w:pPr>
+    </w:p>
+    <w:p>
+      <w:pPr>
+        <w:pStyle w:val="Titre3"/>
         <w:rPr>
           <w:sz w:val="28"/>
           <w:szCs w:val="28"/>
         </w:rPr>
-        <w:t>MVC</w:t>
-      </w:r>
-      <w:bookmarkEnd w:id="12"/>
+      </w:pPr>
+      <w:bookmarkStart w:id="12" w:name="_Toc221873862"/>
       <w:r>
         <w:rPr>
           <w:sz w:val="28"/>
           <w:szCs w:val="28"/>
         </w:rPr>
+        <w:t>MVC</w:t>
+      </w:r>
+      <w:bookmarkEnd w:id="12"/>
+      <w:r>
+        <w:rPr>
+          <w:sz w:val="28"/>
+          <w:szCs w:val="28"/>
+        </w:rPr>
         <w:t xml:space="preserve"> </w:t>
       </w:r>
     </w:p>
@@ -2072,7 +2198,19 @@
         <w:t>I</w:t>
       </w:r>
       <w:r>
-        <w:t>A. La vue sera codée en React et recevra du contrôleur uniquement ce qui lui est</w:t>
+        <w:t xml:space="preserve">A. La vue sera codée en </w:t>
+      </w:r>
+      <w:proofErr w:type="spellStart"/>
+      <w:r>
+        <w:t>React</w:t>
+      </w:r>
+      <w:proofErr w:type="spellEnd"/>
+      <w:r>
+        <w:t xml:space="preserve"> et recevra du contrôleur </w:t>
+      </w:r>
+      <w:r>
+        <w:lastRenderedPageBreak/>
+        <w:t>uniquement ce qui lui est</w:t>
       </w:r>
       <w:r>
         <w:t xml:space="preserve"> nécessaire. Elle enverra au contrôleur la disposition originale de ses pièces et ses différentes actions lors d</w:t>
@@ -2087,8 +2225,13 @@
         <w:t xml:space="preserve">ne utilisation. La classe </w:t>
       </w:r>
       <w:r>
-        <w:lastRenderedPageBreak/>
-        <w:t>Controler dans le backend agira comme tel entre le modèle et la vue. Il sera chargé d</w:t>
+        <w:t>Contrôleur</w:t>
+      </w:r>
+      <w:r>
+        <w:t xml:space="preserve"> </w:t>
+      </w:r>
+      <w:r>
+        <w:t>dans le backend agira comme tel entre le modèle et la vue. Il sera chargé d</w:t>
       </w:r>
       <w:r>
         <w:t>’</w:t>
@@ -2100,16 +2243,113 @@
     <w:p/>
     <w:p>
       <w:pPr>
+        <w:pStyle w:val="Titre1"/>
+      </w:pPr>
+      <w:bookmarkStart w:id="13" w:name="_Toc221873863"/>
+      <w:r>
+        <w:t>Intégration individuelle</w:t>
+      </w:r>
+      <w:bookmarkEnd w:id="13"/>
+    </w:p>
+    <w:p>
+      <w:pPr>
+        <w:pStyle w:val="Titre3"/>
+        <w:rPr>
+          <w:sz w:val="28"/>
+          <w:szCs w:val="28"/>
+        </w:rPr>
+      </w:pPr>
+    </w:p>
+    <w:p>
+      <w:pPr>
         <w:pStyle w:val="Titre2"/>
-      </w:pPr>
-      <w:bookmarkStart w:id="13" w:name="_Toc221873863"/>
-      <w:r>
-        <w:t>Intégration individuelle</w:t>
-      </w:r>
-      <w:bookmarkEnd w:id="13"/>
-    </w:p>
+        <w:rPr>
+          <w:u w:val="single"/>
+        </w:rPr>
+      </w:pPr>
+      <w:r>
+        <w:rPr>
+          <w:u w:val="single"/>
+        </w:rPr>
+        <w:t xml:space="preserve">Choix et implémentation de </w:t>
+      </w:r>
+      <w:proofErr w:type="spellStart"/>
+      <w:r>
+        <w:rPr>
+          <w:u w:val="single"/>
+        </w:rPr>
+        <w:t>React</w:t>
+      </w:r>
+      <w:proofErr w:type="spellEnd"/>
+    </w:p>
+    <w:p/>
+    <w:p>
+      <w:pPr>
+        <w:jc w:val="both"/>
+      </w:pPr>
+      <w:r>
+        <w:t xml:space="preserve">L’interface utilisateur de ce projet sera développée avec </w:t>
+      </w:r>
+      <w:proofErr w:type="spellStart"/>
+      <w:r>
+        <w:t>React</w:t>
+      </w:r>
+      <w:proofErr w:type="spellEnd"/>
+      <w:r>
+        <w:t xml:space="preserve">, une bibliothèque JavaScript idéale pour créer des applications interactives. Dans un jeu comme </w:t>
+      </w:r>
+      <w:proofErr w:type="spellStart"/>
+      <w:r>
+        <w:t>Stratego</w:t>
+      </w:r>
+      <w:proofErr w:type="spellEnd"/>
+      <w:r>
+        <w:t>, les informations évoluent constamment (déplacement d’un pion, écoulement du temps, capture d’une pièce, etc.). Avec du JavaScript classique, le navigateur devrait redessiner toute la page à chaque changement d’état, ce qui pourrait causer des ralentissements.</w:t>
+      </w:r>
+    </w:p>
+    <w:p>
+      <w:pPr>
+        <w:jc w:val="both"/>
+      </w:pPr>
+      <w:proofErr w:type="spellStart"/>
+      <w:r>
+        <w:t>React</w:t>
+      </w:r>
+      <w:proofErr w:type="spellEnd"/>
+      <w:r>
+        <w:t xml:space="preserve"> utilise un DOM virtuel : il détecte précisément ce qui a changé et ne met à jour que l’élément concerné, comme le déplacement d'une seule pièce sur le plateau. Cela garantit que le jeu reste fluide, même lors d'actions rapides.</w:t>
+      </w:r>
+    </w:p>
+    <w:p>
+      <w:pPr>
+        <w:jc w:val="both"/>
+      </w:pPr>
+      <w:r>
+        <w:t xml:space="preserve">De plus, au lieu d’avoir un </w:t>
+      </w:r>
+      <w:r>
+        <w:t xml:space="preserve">seul </w:t>
+      </w:r>
+      <w:r>
+        <w:t xml:space="preserve">bloc de code massif, </w:t>
+      </w:r>
+      <w:proofErr w:type="spellStart"/>
+      <w:r>
+        <w:t>React</w:t>
+      </w:r>
+      <w:proofErr w:type="spellEnd"/>
+      <w:r>
+        <w:t xml:space="preserve"> permet de diviser l’interface en petites pièces indépendantes : les composants (le plateau, les pièces, le score, etc.). Ainsi, pour modifier l’apparence des pions, il suffit de changer un seul fichier sans affecter le reste du système. Cette approche rend le projet beaucoup plus facile à construire, à tester et à faire évoluer</w:t>
+      </w:r>
+      <w:r>
+        <w:t xml:space="preserve"> dans l’avenir.</w:t>
+      </w:r>
+      <w:bookmarkStart w:id="14" w:name="_GoBack"/>
+      <w:bookmarkEnd w:id="14"/>
+    </w:p>
+    <w:p/>
     <w:sectPr>
-      <w:footerReference w:type="default" r:id="rId7"/>
+      <w:footerReference w:type="default" r:id="rId8"/>
       <w:pgSz w:w="12240" w:h="15840"/>
       <w:pgMar w:top="1440" w:right="1800" w:bottom="1440" w:left="1800" w:header="708" w:footer="708" w:gutter="0"/>
       <w:cols w:space="708"/>
@@ -2121,7 +2361,7 @@
 </file>
 
 <file path=word/endnotes.xml><?xml version="1.0" encoding="utf-8"?>
-<w:endnotes xmlns:wpc="http://schemas.microsoft.com/office/word/2010/wordprocessingCanvas" xmlns:cx="http://schemas.microsoft.com/office/drawing/2014/chartex" xmlns:cx1="http://schemas.microsoft.com/office/drawing/2015/9/8/chartex" xmlns:cx2="http://schemas.microsoft.com/office/drawing/2015/10/21/chartex" xmlns:cx3="http://schemas.microsoft.com/office/drawing/2016/5/9/chartex" xmlns:cx4="http://schemas.microsoft.com/office/drawing/2016/5/10/chartex" xmlns:cx5="http://schemas.microsoft.com/office/drawing/2016/5/11/chartex" xmlns:cx6="http://schemas.microsoft.com/office/drawing/2016/5/12/chartex" xmlns:cx7="http://schemas.microsoft.com/office/drawing/2016/5/13/chartex" xmlns:cx8="http://schemas.microsoft.com/office/drawing/2016/5/14/chartex" xmlns:mc="http://schemas.openxmlformats.org/markup-compatibility/2006" xmlns:aink="http://schemas.microsoft.com/office/drawing/2016/ink" xmlns:am3d="http://schemas.microsoft.com/office/drawing/2017/model3d" xmlns:o="urn:schemas-microsoft-com:office:office" xmlns:oel="http://schemas.microsoft.com/office/2019/extlst" xmlns:r="http://schemas.openxmlformats.org/officeDocument/2006/relationships" xmlns:m="http://schemas.openxmlformats.org/officeDocument/2006/math" xmlns:v="urn:schemas-microsoft-com:vml" xmlns:wp14="http://schemas.microsoft.com/office/word/2010/wordprocessingDrawing" xmlns:wp="http://schemas.openxmlformats.org/drawingml/2006/wordprocessingDrawing" xmlns:w10="urn:schemas-microsoft-com:office:word" xmlns:w="http://schemas.openxmlformats.org/wordprocessingml/2006/main" xmlns:w14="http://schemas.microsoft.com/office/word/2010/wordml" xmlns:w15="http://schemas.microsoft.com/office/word/2012/wordml" xmlns:w16cex="http://schemas.microsoft.com/office/word/2018/wordml/cex" xmlns:w16cid="http://schemas.microsoft.com/office/word/2016/wordml/cid" xmlns:w16="http://schemas.microsoft.com/office/word/2018/wordml" xmlns:w16du="http://schemas.microsoft.com/office/word/2023/wordml/word16du" xmlns:w16sdtdh="http://schemas.microsoft.com/office/word/2020/wordml/sdtdatahash" xmlns:w16sdtfl="http://schemas.microsoft.com/office/word/2024/wordml/sdtformatlock" xmlns:w16se="http://schemas.microsoft.com/office/word/2015/wordml/symex" xmlns:wpg="http://schemas.microsoft.com/office/word/2010/wordprocessingGroup" xmlns:wpi="http://schemas.microsoft.com/office/word/2010/wordprocessingInk" xmlns:wne="http://schemas.microsoft.com/office/word/2006/wordml" xmlns:wps="http://schemas.microsoft.com/office/word/2010/wordprocessingShape" mc:Ignorable="w14 w15 w16se w16cid w16 w16cex w16sdtdh w16sdtfl w16du wp14">
+<w:endnotes xmlns:wpc="http://schemas.microsoft.com/office/word/2010/wordprocessingCanvas" xmlns:cx="http://schemas.microsoft.com/office/drawing/2014/chartex" xmlns:cx1="http://schemas.microsoft.com/office/drawing/2015/9/8/chartex" xmlns:cx2="http://schemas.microsoft.com/office/drawing/2015/10/21/chartex" xmlns:cx3="http://schemas.microsoft.com/office/drawing/2016/5/9/chartex" xmlns:cx4="http://schemas.microsoft.com/office/drawing/2016/5/10/chartex" xmlns:cx5="http://schemas.microsoft.com/office/drawing/2016/5/11/chartex" xmlns:cx6="http://schemas.microsoft.com/office/drawing/2016/5/12/chartex" xmlns:cx7="http://schemas.microsoft.com/office/drawing/2016/5/13/chartex" xmlns:cx8="http://schemas.microsoft.com/office/drawing/2016/5/14/chartex" xmlns:mc="http://schemas.openxmlformats.org/markup-compatibility/2006" xmlns:aink="http://schemas.microsoft.com/office/drawing/2016/ink" xmlns:am3d="http://schemas.microsoft.com/office/drawing/2017/model3d" xmlns:o="urn:schemas-microsoft-com:office:office" xmlns:r="http://schemas.openxmlformats.org/officeDocument/2006/relationships" xmlns:m="http://schemas.openxmlformats.org/officeDocument/2006/math" xmlns:v="urn:schemas-microsoft-com:vml" xmlns:wp14="http://schemas.microsoft.com/office/word/2010/wordprocessingDrawing" xmlns:wp="http://schemas.openxmlformats.org/drawingml/2006/wordprocessingDrawing" xmlns:w10="urn:schemas-microsoft-com:office:word" xmlns:w="http://schemas.openxmlformats.org/wordprocessingml/2006/main" xmlns:w14="http://schemas.microsoft.com/office/word/2010/wordml" xmlns:w15="http://schemas.microsoft.com/office/word/2012/wordml" xmlns:w16cid="http://schemas.microsoft.com/office/word/2016/wordml/cid" xmlns:w16se="http://schemas.microsoft.com/office/word/2015/wordml/symex" xmlns:wpg="http://schemas.microsoft.com/office/word/2010/wordprocessingGroup" xmlns:wpi="http://schemas.microsoft.com/office/word/2010/wordprocessingInk" xmlns:wne="http://schemas.microsoft.com/office/word/2006/wordml" xmlns:wps="http://schemas.microsoft.com/office/word/2010/wordprocessingShape" mc:Ignorable="w14 w15 w16se w16cid wp14">
   <w:endnote w:type="separator" w:id="-1">
     <w:p>
       <w:pPr>
@@ -2146,40 +2386,129 @@
 </file>
 
 <file path=word/footer1.xml><?xml version="1.0" encoding="utf-8"?>
-<w:ftr xmlns:wpc="http://schemas.microsoft.com/office/word/2010/wordprocessingCanvas" xmlns:cx="http://schemas.microsoft.com/office/drawing/2014/chartex" xmlns:cx1="http://schemas.microsoft.com/office/drawing/2015/9/8/chartex" xmlns:cx2="http://schemas.microsoft.com/office/drawing/2015/10/21/chartex" xmlns:cx3="http://schemas.microsoft.com/office/drawing/2016/5/9/chartex" xmlns:cx4="http://schemas.microsoft.com/office/drawing/2016/5/10/chartex" xmlns:cx5="http://schemas.microsoft.com/office/drawing/2016/5/11/chartex" xmlns:cx6="http://schemas.microsoft.com/office/drawing/2016/5/12/chartex" xmlns:cx7="http://schemas.microsoft.com/office/drawing/2016/5/13/chartex" xmlns:cx8="http://schemas.microsoft.com/office/drawing/2016/5/14/chartex" xmlns:mc="http://schemas.openxmlformats.org/markup-compatibility/2006" xmlns:aink="http://schemas.microsoft.com/office/drawing/2016/ink" xmlns:am3d="http://schemas.microsoft.com/office/drawing/2017/model3d" xmlns:o="urn:schemas-microsoft-com:office:office" xmlns:oel="http://schemas.microsoft.com/office/2019/extlst" xmlns:r="http://schemas.openxmlformats.org/officeDocument/2006/relationships" xmlns:m="http://schemas.openxmlformats.org/officeDocument/2006/math" xmlns:v="urn:schemas-microsoft-com:vml" xmlns:wp14="http://schemas.microsoft.com/office/word/2010/wordprocessingDrawing" xmlns:wp="http://schemas.openxmlformats.org/drawingml/2006/wordprocessingDrawing" xmlns:w10="urn:schemas-microsoft-com:office:word" xmlns:w="http://schemas.openxmlformats.org/wordprocessingml/2006/main" xmlns:w14="http://schemas.microsoft.com/office/word/2010/wordml" xmlns:w15="http://schemas.microsoft.com/office/word/2012/wordml" xmlns:w16cex="http://schemas.microsoft.com/office/word/2018/wordml/cex" xmlns:w16cid="http://schemas.microsoft.com/office/word/2016/wordml/cid" xmlns:w16="http://schemas.microsoft.com/office/word/2018/wordml" xmlns:w16du="http://schemas.microsoft.com/office/word/2023/wordml/word16du" xmlns:w16sdtdh="http://schemas.microsoft.com/office/word/2020/wordml/sdtdatahash" xmlns:w16sdtfl="http://schemas.microsoft.com/office/word/2024/wordml/sdtformatlock" xmlns:w16se="http://schemas.microsoft.com/office/word/2015/wordml/symex" xmlns:wpg="http://schemas.microsoft.com/office/word/2010/wordprocessingGroup" xmlns:wpi="http://schemas.microsoft.com/office/word/2010/wordprocessingInk" xmlns:wne="http://schemas.microsoft.com/office/word/2006/wordml" xmlns:wps="http://schemas.microsoft.com/office/word/2010/wordprocessingShape" mc:Ignorable="w14 w15 w16se w16cid w16 w16cex w16sdtdh w16sdtfl w16du wp14">
+<w:ftr xmlns:wpc="http://schemas.microsoft.com/office/word/2010/wordprocessingCanvas" xmlns:cx="http://schemas.microsoft.com/office/drawing/2014/chartex" xmlns:cx1="http://schemas.microsoft.com/office/drawing/2015/9/8/chartex" xmlns:cx2="http://schemas.microsoft.com/office/drawing/2015/10/21/chartex" xmlns:cx3="http://schemas.microsoft.com/office/drawing/2016/5/9/chartex" xmlns:cx4="http://schemas.microsoft.com/office/drawing/2016/5/10/chartex" xmlns:cx5="http://schemas.microsoft.com/office/drawing/2016/5/11/chartex" xmlns:cx6="http://schemas.microsoft.com/office/drawing/2016/5/12/chartex" xmlns:cx7="http://schemas.microsoft.com/office/drawing/2016/5/13/chartex" xmlns:cx8="http://schemas.microsoft.com/office/drawing/2016/5/14/chartex" xmlns:mc="http://schemas.openxmlformats.org/markup-compatibility/2006" xmlns:aink="http://schemas.microsoft.com/office/drawing/2016/ink" xmlns:am3d="http://schemas.microsoft.com/office/drawing/2017/model3d" xmlns:o="urn:schemas-microsoft-com:office:office" xmlns:r="http://schemas.openxmlformats.org/officeDocument/2006/relationships" xmlns:m="http://schemas.openxmlformats.org/officeDocument/2006/math" xmlns:v="urn:schemas-microsoft-com:vml" xmlns:wp14="http://schemas.microsoft.com/office/word/2010/wordprocessingDrawing" xmlns:wp="http://schemas.openxmlformats.org/drawingml/2006/wordprocessingDrawing" xmlns:w10="urn:schemas-microsoft-com:office:word" xmlns:w="http://schemas.openxmlformats.org/wordprocessingml/2006/main" xmlns:w14="http://schemas.microsoft.com/office/word/2010/wordml" xmlns:w15="http://schemas.microsoft.com/office/word/2012/wordml" xmlns:w16cid="http://schemas.microsoft.com/office/word/2016/wordml/cid" xmlns:w16se="http://schemas.microsoft.com/office/word/2015/wordml/symex" xmlns:wpg="http://schemas.microsoft.com/office/word/2010/wordprocessingGroup" xmlns:wpi="http://schemas.microsoft.com/office/word/2010/wordprocessingInk" xmlns:wne="http://schemas.microsoft.com/office/word/2006/wordml" xmlns:wps="http://schemas.microsoft.com/office/word/2010/wordprocessingShape" mc:Ignorable="w14 w15 w16se w16cid wp14">
   <w:sdt>
     <w:sdtPr>
-      <w:id w:val="1748076343"/>
+      <w:id w:val="-78914420"/>
       <w:docPartObj>
         <w:docPartGallery w:val="Page Numbers (Bottom of Page)"/>
         <w:docPartUnique/>
       </w:docPartObj>
     </w:sdtPr>
     <w:sdtContent>
-      <w:p>
-        <w:pPr>
-          <w:pStyle w:val="Pieddepage"/>
-          <w:jc w:val="right"/>
-        </w:pPr>
-        <w:r>
-          <w:fldChar w:fldCharType="begin"/>
-        </w:r>
-        <w:r>
-          <w:instrText>PAGE   \* MERGEFORMAT</w:instrText>
-        </w:r>
-        <w:r>
-          <w:fldChar w:fldCharType="separate"/>
-        </w:r>
-        <w:r>
-          <w:rPr>
-            <w:lang w:val="fr-FR"/>
-          </w:rPr>
-          <w:t>2</w:t>
-        </w:r>
-        <w:r>
-          <w:fldChar w:fldCharType="end"/>
-        </w:r>
-      </w:p>
+      <w:sdt>
+        <w:sdtPr>
+          <w:id w:val="1728636285"/>
+          <w:docPartObj>
+            <w:docPartGallery w:val="Page Numbers (Top of Page)"/>
+            <w:docPartUnique/>
+          </w:docPartObj>
+        </w:sdtPr>
+        <w:sdtContent>
+          <w:p>
+            <w:pPr>
+              <w:pStyle w:val="Pieddepage"/>
+              <w:jc w:val="center"/>
+            </w:pPr>
+            <w:r>
+              <w:rPr>
+                <w:lang w:val="fr-FR"/>
+              </w:rPr>
+              <w:t xml:space="preserve">Page </w:t>
+            </w:r>
+            <w:r>
+              <w:rPr>
+                <w:b/>
+                <w:bCs/>
+                <w:sz w:val="24"/>
+                <w:szCs w:val="24"/>
+              </w:rPr>
+              <w:fldChar w:fldCharType="begin"/>
+            </w:r>
+            <w:r>
+              <w:rPr>
+                <w:b/>
+                <w:bCs/>
+              </w:rPr>
+              <w:instrText>PAGE</w:instrText>
+            </w:r>
+            <w:r>
+              <w:rPr>
+                <w:b/>
+                <w:bCs/>
+                <w:sz w:val="24"/>
+                <w:szCs w:val="24"/>
+              </w:rPr>
+              <w:fldChar w:fldCharType="separate"/>
+            </w:r>
+            <w:r>
+              <w:rPr>
+                <w:b/>
+                <w:bCs/>
+                <w:lang w:val="fr-FR"/>
+              </w:rPr>
+              <w:t>2</w:t>
+            </w:r>
+            <w:r>
+              <w:rPr>
+                <w:b/>
+                <w:bCs/>
+                <w:sz w:val="24"/>
+                <w:szCs w:val="24"/>
+              </w:rPr>
+              <w:fldChar w:fldCharType="end"/>
+            </w:r>
+            <w:r>
+              <w:rPr>
+                <w:lang w:val="fr-FR"/>
+              </w:rPr>
+              <w:t xml:space="preserve"> sur </w:t>
+            </w:r>
+            <w:r>
+              <w:rPr>
+                <w:b/>
+                <w:bCs/>
+                <w:sz w:val="24"/>
+                <w:szCs w:val="24"/>
+              </w:rPr>
+              <w:fldChar w:fldCharType="begin"/>
+            </w:r>
+            <w:r>
+              <w:rPr>
+                <w:b/>
+                <w:bCs/>
+              </w:rPr>
+              <w:instrText>NUMPAGES</w:instrText>
+            </w:r>
+            <w:r>
+              <w:rPr>
+                <w:b/>
+                <w:bCs/>
+                <w:sz w:val="24"/>
+                <w:szCs w:val="24"/>
+              </w:rPr>
+              <w:fldChar w:fldCharType="separate"/>
+            </w:r>
+            <w:r>
+              <w:rPr>
+                <w:b/>
+                <w:bCs/>
+                <w:lang w:val="fr-FR"/>
+              </w:rPr>
+              <w:t>2</w:t>
+            </w:r>
+            <w:r>
+              <w:rPr>
+                <w:b/>
+                <w:bCs/>
+                <w:sz w:val="24"/>
+                <w:szCs w:val="24"/>
+              </w:rPr>
+              <w:fldChar w:fldCharType="end"/>
+            </w:r>
+          </w:p>
+        </w:sdtContent>
+      </w:sdt>
     </w:sdtContent>
   </w:sdt>
   <w:p>
@@ -2191,7 +2520,7 @@
 </file>
 
 <file path=word/footnotes.xml><?xml version="1.0" encoding="utf-8"?>
-<w:footnotes xmlns:wpc="http://schemas.microsoft.com/office/word/2010/wordprocessingCanvas" xmlns:cx="http://schemas.microsoft.com/office/drawing/2014/chartex" xmlns:cx1="http://schemas.microsoft.com/office/drawing/2015/9/8/chartex" xmlns:cx2="http://schemas.microsoft.com/office/drawing/2015/10/21/chartex" xmlns:cx3="http://schemas.microsoft.com/office/drawing/2016/5/9/chartex" xmlns:cx4="http://schemas.microsoft.com/office/drawing/2016/5/10/chartex" xmlns:cx5="http://schemas.microsoft.com/office/drawing/2016/5/11/chartex" xmlns:cx6="http://schemas.microsoft.com/office/drawing/2016/5/12/chartex" xmlns:cx7="http://schemas.microsoft.com/office/drawing/2016/5/13/chartex" xmlns:cx8="http://schemas.microsoft.com/office/drawing/2016/5/14/chartex" xmlns:mc="http://schemas.openxmlformats.org/markup-compatibility/2006" xmlns:aink="http://schemas.microsoft.com/office/drawing/2016/ink" xmlns:am3d="http://schemas.microsoft.com/office/drawing/2017/model3d" xmlns:o="urn:schemas-microsoft-com:office:office" xmlns:oel="http://schemas.microsoft.com/office/2019/extlst" xmlns:r="http://schemas.openxmlformats.org/officeDocument/2006/relationships" xmlns:m="http://schemas.openxmlformats.org/officeDocument/2006/math" xmlns:v="urn:schemas-microsoft-com:vml" xmlns:wp14="http://schemas.microsoft.com/office/word/2010/wordprocessingDrawing" xmlns:wp="http://schemas.openxmlformats.org/drawingml/2006/wordprocessingDrawing" xmlns:w10="urn:schemas-microsoft-com:office:word" xmlns:w="http://schemas.openxmlformats.org/wordprocessingml/2006/main" xmlns:w14="http://schemas.microsoft.com/office/word/2010/wordml" xmlns:w15="http://schemas.microsoft.com/office/word/2012/wordml" xmlns:w16cex="http://schemas.microsoft.com/office/word/2018/wordml/cex" xmlns:w16cid="http://schemas.microsoft.com/office/word/2016/wordml/cid" xmlns:w16="http://schemas.microsoft.com/office/word/2018/wordml" xmlns:w16du="http://schemas.microsoft.com/office/word/2023/wordml/word16du" xmlns:w16sdtdh="http://schemas.microsoft.com/office/word/2020/wordml/sdtdatahash" xmlns:w16sdtfl="http://schemas.microsoft.com/office/word/2024/wordml/sdtformatlock" xmlns:w16se="http://schemas.microsoft.com/office/word/2015/wordml/symex" xmlns:wpg="http://schemas.microsoft.com/office/word/2010/wordprocessingGroup" xmlns:wpi="http://schemas.microsoft.com/office/word/2010/wordprocessingInk" xmlns:wne="http://schemas.microsoft.com/office/word/2006/wordml" xmlns:wps="http://schemas.microsoft.com/office/word/2010/wordprocessingShape" mc:Ignorable="w14 w15 w16se w16cid w16 w16cex w16sdtdh w16sdtfl w16du wp14">
+<w:footnotes xmlns:wpc="http://schemas.microsoft.com/office/word/2010/wordprocessingCanvas" xmlns:cx="http://schemas.microsoft.com/office/drawing/2014/chartex" xmlns:cx1="http://schemas.microsoft.com/office/drawing/2015/9/8/chartex" xmlns:cx2="http://schemas.microsoft.com/office/drawing/2015/10/21/chartex" xmlns:cx3="http://schemas.microsoft.com/office/drawing/2016/5/9/chartex" xmlns:cx4="http://schemas.microsoft.com/office/drawing/2016/5/10/chartex" xmlns:cx5="http://schemas.microsoft.com/office/drawing/2016/5/11/chartex" xmlns:cx6="http://schemas.microsoft.com/office/drawing/2016/5/12/chartex" xmlns:cx7="http://schemas.microsoft.com/office/drawing/2016/5/13/chartex" xmlns:cx8="http://schemas.microsoft.com/office/drawing/2016/5/14/chartex" xmlns:mc="http://schemas.openxmlformats.org/markup-compatibility/2006" xmlns:aink="http://schemas.microsoft.com/office/drawing/2016/ink" xmlns:am3d="http://schemas.microsoft.com/office/drawing/2017/model3d" xmlns:o="urn:schemas-microsoft-com:office:office" xmlns:r="http://schemas.openxmlformats.org/officeDocument/2006/relationships" xmlns:m="http://schemas.openxmlformats.org/officeDocument/2006/math" xmlns:v="urn:schemas-microsoft-com:vml" xmlns:wp14="http://schemas.microsoft.com/office/word/2010/wordprocessingDrawing" xmlns:wp="http://schemas.openxmlformats.org/drawingml/2006/wordprocessingDrawing" xmlns:w10="urn:schemas-microsoft-com:office:word" xmlns:w="http://schemas.openxmlformats.org/wordprocessingml/2006/main" xmlns:w14="http://schemas.microsoft.com/office/word/2010/wordml" xmlns:w15="http://schemas.microsoft.com/office/word/2012/wordml" xmlns:w16cid="http://schemas.microsoft.com/office/word/2016/wordml/cid" xmlns:w16se="http://schemas.microsoft.com/office/word/2015/wordml/symex" xmlns:wpg="http://schemas.microsoft.com/office/word/2010/wordprocessingGroup" xmlns:wpi="http://schemas.microsoft.com/office/word/2010/wordprocessingInk" xmlns:wne="http://schemas.microsoft.com/office/word/2006/wordml" xmlns:wps="http://schemas.microsoft.com/office/word/2010/wordprocessingShape" mc:Ignorable="w14 w15 w16se w16cid wp14">
   <w:footnote w:type="separator" w:id="-1">
     <w:p>
       <w:pPr>
@@ -2215,8 +2544,165 @@
 </w:footnotes>
 </file>
 
+<file path=word/numbering.xml><?xml version="1.0" encoding="utf-8"?>
+<w:numbering xmlns:wpc="http://schemas.microsoft.com/office/word/2010/wordprocessingCanvas" xmlns:cx="http://schemas.microsoft.com/office/drawing/2014/chartex" xmlns:cx1="http://schemas.microsoft.com/office/drawing/2015/9/8/chartex" xmlns:cx2="http://schemas.microsoft.com/office/drawing/2015/10/21/chartex" xmlns:cx3="http://schemas.microsoft.com/office/drawing/2016/5/9/chartex" xmlns:cx4="http://schemas.microsoft.com/office/drawing/2016/5/10/chartex" xmlns:cx5="http://schemas.microsoft.com/office/drawing/2016/5/11/chartex" xmlns:cx6="http://schemas.microsoft.com/office/drawing/2016/5/12/chartex" xmlns:cx7="http://schemas.microsoft.com/office/drawing/2016/5/13/chartex" xmlns:cx8="http://schemas.microsoft.com/office/drawing/2016/5/14/chartex" xmlns:mc="http://schemas.openxmlformats.org/markup-compatibility/2006" xmlns:aink="http://schemas.microsoft.com/office/drawing/2016/ink" xmlns:am3d="http://schemas.microsoft.com/office/drawing/2017/model3d" xmlns:o="urn:schemas-microsoft-com:office:office" xmlns:r="http://schemas.openxmlformats.org/officeDocument/2006/relationships" xmlns:m="http://schemas.openxmlformats.org/officeDocument/2006/math" xmlns:v="urn:schemas-microsoft-com:vml" xmlns:wp14="http://schemas.microsoft.com/office/word/2010/wordprocessingDrawing" xmlns:wp="http://schemas.openxmlformats.org/drawingml/2006/wordprocessingDrawing" xmlns:w10="urn:schemas-microsoft-com:office:word" xmlns:w="http://schemas.openxmlformats.org/wordprocessingml/2006/main" xmlns:w14="http://schemas.microsoft.com/office/word/2010/wordml" xmlns:w15="http://schemas.microsoft.com/office/word/2012/wordml" xmlns:w16cid="http://schemas.microsoft.com/office/word/2016/wordml/cid" xmlns:w16se="http://schemas.microsoft.com/office/word/2015/wordml/symex" xmlns:wpg="http://schemas.microsoft.com/office/word/2010/wordprocessingGroup" xmlns:wpi="http://schemas.microsoft.com/office/word/2010/wordprocessingInk" xmlns:wne="http://schemas.microsoft.com/office/word/2006/wordml" xmlns:wps="http://schemas.microsoft.com/office/word/2010/wordprocessingShape" mc:Ignorable="w14 w15 w16se w16cid wp14">
+  <w:abstractNum w:abstractNumId="0" w15:restartNumberingAfterBreak="0">
+    <w:nsid w:val="6E4B134E"/>
+    <w:multiLevelType w:val="multilevel"/>
+    <w:tmpl w:val="B9EC0D16"/>
+    <w:lvl w:ilvl="0">
+      <w:start w:val="1"/>
+      <w:numFmt w:val="bullet"/>
+      <w:lvlText w:val=""/>
+      <w:lvlJc w:val="left"/>
+      <w:pPr>
+        <w:tabs>
+          <w:tab w:val="num" w:pos="720"/>
+        </w:tabs>
+        <w:ind w:left="720" w:hanging="360"/>
+      </w:pPr>
+      <w:rPr>
+        <w:rFonts w:ascii="Symbol" w:hAnsi="Symbol" w:hint="default"/>
+        <w:sz w:val="20"/>
+      </w:rPr>
+    </w:lvl>
+    <w:lvl w:ilvl="1" w:tentative="1">
+      <w:start w:val="1"/>
+      <w:numFmt w:val="bullet"/>
+      <w:lvlText w:val="o"/>
+      <w:lvlJc w:val="left"/>
+      <w:pPr>
+        <w:tabs>
+          <w:tab w:val="num" w:pos="1440"/>
+        </w:tabs>
+        <w:ind w:left="1440" w:hanging="360"/>
+      </w:pPr>
+      <w:rPr>
+        <w:rFonts w:ascii="Courier New" w:hAnsi="Courier New" w:hint="default"/>
+        <w:sz w:val="20"/>
+      </w:rPr>
+    </w:lvl>
+    <w:lvl w:ilvl="2" w:tentative="1">
+      <w:start w:val="1"/>
+      <w:numFmt w:val="bullet"/>
+      <w:lvlText w:val=""/>
+      <w:lvlJc w:val="left"/>
+      <w:pPr>
+        <w:tabs>
+          <w:tab w:val="num" w:pos="2160"/>
+        </w:tabs>
+        <w:ind w:left="2160" w:hanging="360"/>
+      </w:pPr>
+      <w:rPr>
+        <w:rFonts w:ascii="Wingdings" w:hAnsi="Wingdings" w:hint="default"/>
+        <w:sz w:val="20"/>
+      </w:rPr>
+    </w:lvl>
+    <w:lvl w:ilvl="3" w:tentative="1">
+      <w:start w:val="1"/>
+      <w:numFmt w:val="bullet"/>
+      <w:lvlText w:val=""/>
+      <w:lvlJc w:val="left"/>
+      <w:pPr>
+        <w:tabs>
+          <w:tab w:val="num" w:pos="2880"/>
+        </w:tabs>
+        <w:ind w:left="2880" w:hanging="360"/>
+      </w:pPr>
+      <w:rPr>
+        <w:rFonts w:ascii="Wingdings" w:hAnsi="Wingdings" w:hint="default"/>
+        <w:sz w:val="20"/>
+      </w:rPr>
+    </w:lvl>
+    <w:lvl w:ilvl="4" w:tentative="1">
+      <w:start w:val="1"/>
+      <w:numFmt w:val="bullet"/>
+      <w:lvlText w:val=""/>
+      <w:lvlJc w:val="left"/>
+      <w:pPr>
+        <w:tabs>
+          <w:tab w:val="num" w:pos="3600"/>
+        </w:tabs>
+        <w:ind w:left="3600" w:hanging="360"/>
+      </w:pPr>
+      <w:rPr>
+        <w:rFonts w:ascii="Wingdings" w:hAnsi="Wingdings" w:hint="default"/>
+        <w:sz w:val="20"/>
+      </w:rPr>
+    </w:lvl>
+    <w:lvl w:ilvl="5" w:tentative="1">
+      <w:start w:val="1"/>
+      <w:numFmt w:val="bullet"/>
+      <w:lvlText w:val=""/>
+      <w:lvlJc w:val="left"/>
+      <w:pPr>
+        <w:tabs>
+          <w:tab w:val="num" w:pos="4320"/>
+        </w:tabs>
+        <w:ind w:left="4320" w:hanging="360"/>
+      </w:pPr>
+      <w:rPr>
+        <w:rFonts w:ascii="Wingdings" w:hAnsi="Wingdings" w:hint="default"/>
+        <w:sz w:val="20"/>
+      </w:rPr>
+    </w:lvl>
+    <w:lvl w:ilvl="6" w:tentative="1">
+      <w:start w:val="1"/>
+      <w:numFmt w:val="bullet"/>
+      <w:lvlText w:val=""/>
+      <w:lvlJc w:val="left"/>
+      <w:pPr>
+        <w:tabs>
+          <w:tab w:val="num" w:pos="5040"/>
+        </w:tabs>
+        <w:ind w:left="5040" w:hanging="360"/>
+      </w:pPr>
+      <w:rPr>
+        <w:rFonts w:ascii="Wingdings" w:hAnsi="Wingdings" w:hint="default"/>
+        <w:sz w:val="20"/>
+      </w:rPr>
+    </w:lvl>
+    <w:lvl w:ilvl="7" w:tentative="1">
+      <w:start w:val="1"/>
+      <w:numFmt w:val="bullet"/>
+      <w:lvlText w:val=""/>
+      <w:lvlJc w:val="left"/>
+      <w:pPr>
+        <w:tabs>
+          <w:tab w:val="num" w:pos="5760"/>
+        </w:tabs>
+        <w:ind w:left="5760" w:hanging="360"/>
+      </w:pPr>
+      <w:rPr>
+        <w:rFonts w:ascii="Wingdings" w:hAnsi="Wingdings" w:hint="default"/>
+        <w:sz w:val="20"/>
+      </w:rPr>
+    </w:lvl>
+    <w:lvl w:ilvl="8" w:tentative="1">
+      <w:start w:val="1"/>
+      <w:numFmt w:val="bullet"/>
+      <w:lvlText w:val=""/>
+      <w:lvlJc w:val="left"/>
+      <w:pPr>
+        <w:tabs>
+          <w:tab w:val="num" w:pos="6480"/>
+        </w:tabs>
+        <w:ind w:left="6480" w:hanging="360"/>
+      </w:pPr>
+      <w:rPr>
+        <w:rFonts w:ascii="Wingdings" w:hAnsi="Wingdings" w:hint="default"/>
+        <w:sz w:val="20"/>
+      </w:rPr>
+    </w:lvl>
+  </w:abstractNum>
+  <w:num w:numId="1">
+    <w:abstractNumId w:val="0"/>
+  </w:num>
+</w:numbering>
+</file>
+
 <file path=word/styles.xml><?xml version="1.0" encoding="utf-8"?>
-<w:styles xmlns:mc="http://schemas.openxmlformats.org/markup-compatibility/2006" xmlns:r="http://schemas.openxmlformats.org/officeDocument/2006/relationships" xmlns:w="http://schemas.openxmlformats.org/wordprocessingml/2006/main" xmlns:w14="http://schemas.microsoft.com/office/word/2010/wordml" xmlns:w15="http://schemas.microsoft.com/office/word/2012/wordml" xmlns:w16cex="http://schemas.microsoft.com/office/word/2018/wordml/cex" xmlns:w16cid="http://schemas.microsoft.com/office/word/2016/wordml/cid" xmlns:w16="http://schemas.microsoft.com/office/word/2018/wordml" xmlns:w16du="http://schemas.microsoft.com/office/word/2023/wordml/word16du" xmlns:w16sdtdh="http://schemas.microsoft.com/office/word/2020/wordml/sdtdatahash" xmlns:w16sdtfl="http://schemas.microsoft.com/office/word/2024/wordml/sdtformatlock" xmlns:w16se="http://schemas.microsoft.com/office/word/2015/wordml/symex" mc:Ignorable="w14 w15 w16se w16cid w16 w16cex w16sdtdh w16sdtfl w16du">
+<w:styles xmlns:mc="http://schemas.openxmlformats.org/markup-compatibility/2006" xmlns:r="http://schemas.openxmlformats.org/officeDocument/2006/relationships" xmlns:w="http://schemas.openxmlformats.org/wordprocessingml/2006/main" xmlns:w14="http://schemas.microsoft.com/office/word/2010/wordml" xmlns:w15="http://schemas.microsoft.com/office/word/2012/wordml" xmlns:w16cid="http://schemas.microsoft.com/office/word/2016/wordml/cid" xmlns:w16se="http://schemas.microsoft.com/office/word/2015/wordml/symex" mc:Ignorable="w14 w15 w16se w16cid">
   <w:docDefaults>
     <w:rPrDefault>
       <w:rPr>
@@ -2232,7 +2718,7 @@
       </w:pPr>
     </w:pPrDefault>
   </w:docDefaults>
-  <w:latentStyles w:defLockedState="0" w:defUIPriority="99" w:defSemiHidden="0" w:defUnhideWhenUsed="0" w:defQFormat="0" w:count="376">
+  <w:latentStyles w:defLockedState="0" w:defUIPriority="99" w:defSemiHidden="0" w:defUnhideWhenUsed="0" w:defQFormat="0" w:count="375">
     <w:lsdException w:name="Normal" w:uiPriority="0" w:qFormat="1"/>
     <w:lsdException w:name="heading 1" w:uiPriority="9" w:qFormat="1"/>
     <w:lsdException w:name="heading 2" w:semiHidden="1" w:uiPriority="9" w:unhideWhenUsed="1" w:qFormat="1"/>
@@ -2608,7 +3094,6 @@
     <w:lsdException w:name="Smart Hyperlink" w:semiHidden="1" w:unhideWhenUsed="1"/>
     <w:lsdException w:name="Hashtag" w:semiHidden="1" w:unhideWhenUsed="1"/>
     <w:lsdException w:name="Unresolved Mention" w:semiHidden="1" w:unhideWhenUsed="1"/>
-    <w:lsdException w:name="Smart Link" w:semiHidden="1" w:unhideWhenUsed="1"/>
   </w:latentStyles>
   <w:style w:type="paragraph" w:default="1" w:styleId="Normal">
     <w:name w:val="Normal"/>
@@ -3383,6 +3868,23 @@
       <w:spacing w:after="100"/>
       <w:ind w:left="420"/>
     </w:pPr>
+  </w:style>
+  <w:style w:type="paragraph" w:styleId="NormalWeb">
+    <w:name w:val="Normal (Web)"/>
+    <w:basedOn w:val="Normal"/>
+    <w:uiPriority w:val="99"/>
+    <w:semiHidden/>
+    <w:unhideWhenUsed/>
+    <w:rsid w:val="00EF4639"/>
+    <w:pPr>
+      <w:spacing w:before="100" w:beforeAutospacing="1" w:after="100" w:afterAutospacing="1" w:line="240" w:lineRule="auto"/>
+    </w:pPr>
+    <w:rPr>
+      <w:rFonts w:ascii="Times New Roman" w:eastAsia="Times New Roman" w:hAnsi="Times New Roman" w:cs="Times New Roman"/>
+      <w:sz w:val="24"/>
+      <w:szCs w:val="24"/>
+      <w:lang w:eastAsia="fr-CA"/>
+    </w:rPr>
   </w:style>
 </w:styles>
 </file>
@@ -3707,7 +4209,7 @@
 </file>
 
 <file path=customXml/itemProps1.xml><?xml version="1.0" encoding="utf-8"?>
-<ds:datastoreItem xmlns:ds="http://schemas.openxmlformats.org/officeDocument/2006/customXml" ds:itemID="{E2DC9E07-E1CD-4359-A71E-F95EC72EFEBB}">
+<ds:datastoreItem xmlns:ds="http://schemas.openxmlformats.org/officeDocument/2006/customXml" ds:itemID="{7F39B29A-795E-4526-9ED6-3CEB3E04DF16}">
   <ds:schemaRefs>
     <ds:schemaRef ds:uri="http://schemas.openxmlformats.org/officeDocument/2006/bibliography"/>
   </ds:schemaRefs>

</xml_diff>

<commit_message>
ajout maquette dans document conception
</commit_message>
<xml_diff>
--- a/doc/C61_-_Document de conception_L_Attaque.docx
+++ b/doc/C61_-_Document de conception_L_Attaque.docx
@@ -1687,111 +1687,1327 @@
       <w:pPr>
         <w:pStyle w:val="Titre1"/>
       </w:pPr>
+      <w:bookmarkStart w:id="3" w:name="_Toc221873853"/>
+      <w:r>
+        <w:rPr>
+          <w:noProof/>
+        </w:rPr>
+        <w:lastRenderedPageBreak/>
+        <w:drawing>
+          <wp:anchor distT="0" distB="0" distL="114300" distR="114300" simplePos="0" relativeHeight="251660288" behindDoc="1" locked="0" layoutInCell="1" allowOverlap="1" wp14:anchorId="5BBEBD47" wp14:editId="66205314">
+            <wp:simplePos x="0" y="0"/>
+            <wp:positionH relativeFrom="margin">
+              <wp:posOffset>-445308</wp:posOffset>
+            </wp:positionH>
+            <wp:positionV relativeFrom="paragraph">
+              <wp:posOffset>401702</wp:posOffset>
+            </wp:positionV>
+            <wp:extent cx="6786646" cy="4128596"/>
+            <wp:effectExtent l="0" t="0" r="0" b="5715"/>
+            <wp:wrapNone/>
+            <wp:docPr id="1" name="Image 1"/>
+            <wp:cNvGraphicFramePr>
+              <a:graphicFrameLocks xmlns:a="http://schemas.openxmlformats.org/drawingml/2006/main" noChangeAspect="1"/>
+            </wp:cNvGraphicFramePr>
+            <a:graphic xmlns:a="http://schemas.openxmlformats.org/drawingml/2006/main">
+              <a:graphicData uri="http://schemas.openxmlformats.org/drawingml/2006/picture">
+                <pic:pic xmlns:pic="http://schemas.openxmlformats.org/drawingml/2006/picture">
+                  <pic:nvPicPr>
+                    <pic:cNvPr id="1" name=""/>
+                    <pic:cNvPicPr/>
+                  </pic:nvPicPr>
+                  <pic:blipFill>
+                    <a:blip r:embed="rId9" cstate="print">
+                      <a:extLst>
+                        <a:ext uri="{28A0092B-C50C-407E-A947-70E740481C1C}">
+                          <a14:useLocalDpi xmlns:a14="http://schemas.microsoft.com/office/drawing/2010/main" val="0"/>
+                        </a:ext>
+                      </a:extLst>
+                    </a:blip>
+                    <a:stretch>
+                      <a:fillRect/>
+                    </a:stretch>
+                  </pic:blipFill>
+                  <pic:spPr>
+                    <a:xfrm>
+                      <a:off x="0" y="0"/>
+                      <a:ext cx="6817247" cy="4147212"/>
+                    </a:xfrm>
+                    <a:prstGeom prst="rect">
+                      <a:avLst/>
+                    </a:prstGeom>
+                  </pic:spPr>
+                </pic:pic>
+              </a:graphicData>
+            </a:graphic>
+            <wp14:sizeRelH relativeFrom="margin">
+              <wp14:pctWidth>0</wp14:pctWidth>
+            </wp14:sizeRelH>
+            <wp14:sizeRelV relativeFrom="margin">
+              <wp14:pctHeight>0</wp14:pctHeight>
+            </wp14:sizeRelV>
+          </wp:anchor>
+        </w:drawing>
+      </w:r>
+      <w:r>
+        <w:t>Maquettes</w:t>
+      </w:r>
+      <w:bookmarkEnd w:id="3"/>
+    </w:p>
+    <w:p/>
+    <w:p/>
+    <w:p/>
+    <w:p/>
+    <w:p/>
+    <w:p/>
+    <w:p/>
+    <w:p/>
+    <w:p/>
+    <w:p/>
+    <w:p/>
+    <w:p/>
+    <w:p>
+      <w:r>
+        <w:rPr>
+          <w:noProof/>
+        </w:rPr>
+        <w:drawing>
+          <wp:anchor distT="0" distB="0" distL="114300" distR="114300" simplePos="0" relativeHeight="251659264" behindDoc="1" locked="0" layoutInCell="1" allowOverlap="1" wp14:anchorId="5E622A65" wp14:editId="255FE972">
+            <wp:simplePos x="0" y="0"/>
+            <wp:positionH relativeFrom="margin">
+              <wp:posOffset>-281455</wp:posOffset>
+            </wp:positionH>
+            <wp:positionV relativeFrom="paragraph">
+              <wp:posOffset>138271</wp:posOffset>
+            </wp:positionV>
+            <wp:extent cx="6472081" cy="4159727"/>
+            <wp:effectExtent l="0" t="0" r="5080" b="0"/>
+            <wp:wrapNone/>
+            <wp:docPr id="2" name="Image 2"/>
+            <wp:cNvGraphicFramePr>
+              <a:graphicFrameLocks xmlns:a="http://schemas.openxmlformats.org/drawingml/2006/main" noChangeAspect="1"/>
+            </wp:cNvGraphicFramePr>
+            <a:graphic xmlns:a="http://schemas.openxmlformats.org/drawingml/2006/main">
+              <a:graphicData uri="http://schemas.openxmlformats.org/drawingml/2006/picture">
+                <pic:pic xmlns:pic="http://schemas.openxmlformats.org/drawingml/2006/picture">
+                  <pic:nvPicPr>
+                    <pic:cNvPr id="1" name=""/>
+                    <pic:cNvPicPr/>
+                  </pic:nvPicPr>
+                  <pic:blipFill>
+                    <a:blip r:embed="rId10" cstate="print">
+                      <a:extLst>
+                        <a:ext uri="{28A0092B-C50C-407E-A947-70E740481C1C}">
+                          <a14:useLocalDpi xmlns:a14="http://schemas.microsoft.com/office/drawing/2010/main" val="0"/>
+                        </a:ext>
+                      </a:extLst>
+                    </a:blip>
+                    <a:stretch>
+                      <a:fillRect/>
+                    </a:stretch>
+                  </pic:blipFill>
+                  <pic:spPr>
+                    <a:xfrm>
+                      <a:off x="0" y="0"/>
+                      <a:ext cx="6503266" cy="4179770"/>
+                    </a:xfrm>
+                    <a:prstGeom prst="rect">
+                      <a:avLst/>
+                    </a:prstGeom>
+                  </pic:spPr>
+                </pic:pic>
+              </a:graphicData>
+            </a:graphic>
+            <wp14:sizeRelH relativeFrom="margin">
+              <wp14:pctWidth>0</wp14:pctWidth>
+            </wp14:sizeRelH>
+            <wp14:sizeRelV relativeFrom="margin">
+              <wp14:pctHeight>0</wp14:pctHeight>
+            </wp14:sizeRelV>
+          </wp:anchor>
+        </w:drawing>
+      </w:r>
+    </w:p>
+    <w:p/>
+    <w:p/>
+    <w:p/>
+    <w:p/>
+    <w:p/>
+    <w:p/>
+    <w:p/>
+    <w:p/>
+    <w:p/>
+    <w:p/>
+    <w:p/>
+    <w:p/>
+    <w:p/>
+    <w:p>
+      <w:r>
+        <w:rPr>
+          <w:noProof/>
+        </w:rPr>
+        <w:lastRenderedPageBreak/>
+        <w:drawing>
+          <wp:anchor distT="0" distB="0" distL="114300" distR="114300" simplePos="0" relativeHeight="251661312" behindDoc="1" locked="0" layoutInCell="1" allowOverlap="1" wp14:anchorId="5FD54074" wp14:editId="0329FB67">
+            <wp:simplePos x="0" y="0"/>
+            <wp:positionH relativeFrom="margin">
+              <wp:posOffset>-91175</wp:posOffset>
+            </wp:positionH>
+            <wp:positionV relativeFrom="paragraph">
+              <wp:posOffset>-560268</wp:posOffset>
+            </wp:positionV>
+            <wp:extent cx="6141808" cy="4592871"/>
+            <wp:effectExtent l="0" t="0" r="0" b="0"/>
+            <wp:wrapNone/>
+            <wp:docPr id="3" name="Image 3"/>
+            <wp:cNvGraphicFramePr>
+              <a:graphicFrameLocks xmlns:a="http://schemas.openxmlformats.org/drawingml/2006/main" noChangeAspect="1"/>
+            </wp:cNvGraphicFramePr>
+            <a:graphic xmlns:a="http://schemas.openxmlformats.org/drawingml/2006/main">
+              <a:graphicData uri="http://schemas.openxmlformats.org/drawingml/2006/picture">
+                <pic:pic xmlns:pic="http://schemas.openxmlformats.org/drawingml/2006/picture">
+                  <pic:nvPicPr>
+                    <pic:cNvPr id="1" name=""/>
+                    <pic:cNvPicPr/>
+                  </pic:nvPicPr>
+                  <pic:blipFill>
+                    <a:blip r:embed="rId11" cstate="print">
+                      <a:extLst>
+                        <a:ext uri="{28A0092B-C50C-407E-A947-70E740481C1C}">
+                          <a14:useLocalDpi xmlns:a14="http://schemas.microsoft.com/office/drawing/2010/main" val="0"/>
+                        </a:ext>
+                      </a:extLst>
+                    </a:blip>
+                    <a:stretch>
+                      <a:fillRect/>
+                    </a:stretch>
+                  </pic:blipFill>
+                  <pic:spPr>
+                    <a:xfrm>
+                      <a:off x="0" y="0"/>
+                      <a:ext cx="6157663" cy="4604727"/>
+                    </a:xfrm>
+                    <a:prstGeom prst="rect">
+                      <a:avLst/>
+                    </a:prstGeom>
+                  </pic:spPr>
+                </pic:pic>
+              </a:graphicData>
+            </a:graphic>
+            <wp14:sizeRelH relativeFrom="margin">
+              <wp14:pctWidth>0</wp14:pctWidth>
+            </wp14:sizeRelH>
+            <wp14:sizeRelV relativeFrom="margin">
+              <wp14:pctHeight>0</wp14:pctHeight>
+            </wp14:sizeRelV>
+          </wp:anchor>
+        </w:drawing>
+      </w:r>
+    </w:p>
+    <w:p/>
+    <w:p>
+      <w:pPr>
+        <w:rPr>
+          <w:b/>
+          <w:bCs/>
+        </w:rPr>
+      </w:pPr>
+    </w:p>
+    <w:p>
+      <w:pPr>
+        <w:rPr>
+          <w:b/>
+          <w:bCs/>
+        </w:rPr>
+      </w:pPr>
+    </w:p>
+    <w:p>
+      <w:pPr>
+        <w:rPr>
+          <w:b/>
+          <w:bCs/>
+        </w:rPr>
+      </w:pPr>
+    </w:p>
+    <w:p>
+      <w:pPr>
+        <w:rPr>
+          <w:b/>
+          <w:bCs/>
+        </w:rPr>
+      </w:pPr>
+    </w:p>
+    <w:p>
+      <w:pPr>
+        <w:rPr>
+          <w:b/>
+          <w:bCs/>
+        </w:rPr>
+      </w:pPr>
+    </w:p>
+    <w:p>
+      <w:pPr>
+        <w:rPr>
+          <w:b/>
+          <w:bCs/>
+        </w:rPr>
+      </w:pPr>
+    </w:p>
+    <w:p>
+      <w:pPr>
+        <w:rPr>
+          <w:b/>
+          <w:bCs/>
+        </w:rPr>
+      </w:pPr>
+    </w:p>
+    <w:p>
+      <w:pPr>
+        <w:rPr>
+          <w:b/>
+          <w:bCs/>
+        </w:rPr>
+      </w:pPr>
+    </w:p>
+    <w:p>
+      <w:pPr>
+        <w:rPr>
+          <w:b/>
+          <w:bCs/>
+        </w:rPr>
+      </w:pPr>
+    </w:p>
+    <w:p>
+      <w:pPr>
+        <w:rPr>
+          <w:b/>
+          <w:bCs/>
+        </w:rPr>
+      </w:pPr>
+    </w:p>
+    <w:p>
+      <w:pPr>
+        <w:rPr>
+          <w:b/>
+          <w:bCs/>
+        </w:rPr>
+      </w:pPr>
+      <w:r>
+        <w:rPr>
+          <w:noProof/>
+        </w:rPr>
+        <w:drawing>
+          <wp:anchor distT="0" distB="0" distL="114300" distR="114300" simplePos="0" relativeHeight="251662336" behindDoc="1" locked="0" layoutInCell="1" allowOverlap="1" wp14:anchorId="63DB0E89" wp14:editId="1B2EFCAA">
+            <wp:simplePos x="0" y="0"/>
+            <wp:positionH relativeFrom="margin">
+              <wp:posOffset>-48359</wp:posOffset>
+            </wp:positionH>
+            <wp:positionV relativeFrom="paragraph">
+              <wp:posOffset>123132</wp:posOffset>
+            </wp:positionV>
+            <wp:extent cx="6221092" cy="4510292"/>
+            <wp:effectExtent l="0" t="0" r="8890" b="5080"/>
+            <wp:wrapNone/>
+            <wp:docPr id="4" name="Image 4"/>
+            <wp:cNvGraphicFramePr>
+              <a:graphicFrameLocks xmlns:a="http://schemas.openxmlformats.org/drawingml/2006/main" noChangeAspect="1"/>
+            </wp:cNvGraphicFramePr>
+            <a:graphic xmlns:a="http://schemas.openxmlformats.org/drawingml/2006/main">
+              <a:graphicData uri="http://schemas.openxmlformats.org/drawingml/2006/picture">
+                <pic:pic xmlns:pic="http://schemas.openxmlformats.org/drawingml/2006/picture">
+                  <pic:nvPicPr>
+                    <pic:cNvPr id="1" name=""/>
+                    <pic:cNvPicPr/>
+                  </pic:nvPicPr>
+                  <pic:blipFill>
+                    <a:blip r:embed="rId12" cstate="print">
+                      <a:extLst>
+                        <a:ext uri="{28A0092B-C50C-407E-A947-70E740481C1C}">
+                          <a14:useLocalDpi xmlns:a14="http://schemas.microsoft.com/office/drawing/2010/main" val="0"/>
+                        </a:ext>
+                      </a:extLst>
+                    </a:blip>
+                    <a:stretch>
+                      <a:fillRect/>
+                    </a:stretch>
+                  </pic:blipFill>
+                  <pic:spPr>
+                    <a:xfrm>
+                      <a:off x="0" y="0"/>
+                      <a:ext cx="6221092" cy="4510292"/>
+                    </a:xfrm>
+                    <a:prstGeom prst="rect">
+                      <a:avLst/>
+                    </a:prstGeom>
+                  </pic:spPr>
+                </pic:pic>
+              </a:graphicData>
+            </a:graphic>
+            <wp14:sizeRelH relativeFrom="margin">
+              <wp14:pctWidth>0</wp14:pctWidth>
+            </wp14:sizeRelH>
+            <wp14:sizeRelV relativeFrom="margin">
+              <wp14:pctHeight>0</wp14:pctHeight>
+            </wp14:sizeRelV>
+          </wp:anchor>
+        </w:drawing>
+      </w:r>
+    </w:p>
+    <w:p>
+      <w:pPr>
+        <w:rPr>
+          <w:b/>
+          <w:bCs/>
+        </w:rPr>
+      </w:pPr>
+    </w:p>
+    <w:p>
+      <w:pPr>
+        <w:rPr>
+          <w:b/>
+          <w:bCs/>
+        </w:rPr>
+      </w:pPr>
+    </w:p>
+    <w:p>
+      <w:pPr>
+        <w:rPr>
+          <w:b/>
+          <w:bCs/>
+        </w:rPr>
+      </w:pPr>
+    </w:p>
+    <w:p>
+      <w:pPr>
+        <w:rPr>
+          <w:b/>
+          <w:bCs/>
+        </w:rPr>
+      </w:pPr>
+    </w:p>
+    <w:p>
+      <w:pPr>
+        <w:rPr>
+          <w:b/>
+          <w:bCs/>
+        </w:rPr>
+      </w:pPr>
+    </w:p>
+    <w:p>
+      <w:pPr>
+        <w:rPr>
+          <w:b/>
+          <w:bCs/>
+        </w:rPr>
+      </w:pPr>
+    </w:p>
+    <w:p>
+      <w:pPr>
+        <w:rPr>
+          <w:b/>
+          <w:bCs/>
+        </w:rPr>
+      </w:pPr>
+    </w:p>
+    <w:p>
+      <w:pPr>
+        <w:rPr>
+          <w:b/>
+          <w:bCs/>
+        </w:rPr>
+      </w:pPr>
+    </w:p>
+    <w:p>
+      <w:pPr>
+        <w:rPr>
+          <w:b/>
+          <w:bCs/>
+        </w:rPr>
+      </w:pPr>
+    </w:p>
+    <w:p>
+      <w:pPr>
+        <w:rPr>
+          <w:b/>
+          <w:bCs/>
+        </w:rPr>
+      </w:pPr>
+    </w:p>
+    <w:p>
+      <w:pPr>
+        <w:rPr>
+          <w:b/>
+          <w:bCs/>
+        </w:rPr>
+      </w:pPr>
+    </w:p>
+    <w:p>
+      <w:pPr>
+        <w:rPr>
+          <w:b/>
+          <w:bCs/>
+        </w:rPr>
+      </w:pPr>
+    </w:p>
+    <w:p>
+      <w:pPr>
+        <w:rPr>
+          <w:b/>
+          <w:bCs/>
+        </w:rPr>
+      </w:pPr>
+    </w:p>
+    <w:p>
+      <w:pPr>
+        <w:rPr>
+          <w:b/>
+          <w:bCs/>
+        </w:rPr>
+      </w:pPr>
+    </w:p>
+    <w:p>
+      <w:pPr>
+        <w:rPr>
+          <w:b/>
+          <w:bCs/>
+        </w:rPr>
+      </w:pPr>
+      <w:r>
+        <w:rPr>
+          <w:noProof/>
+        </w:rPr>
+        <w:lastRenderedPageBreak/>
+        <w:drawing>
+          <wp:anchor distT="0" distB="0" distL="114300" distR="114300" simplePos="0" relativeHeight="251663360" behindDoc="1" locked="0" layoutInCell="1" allowOverlap="1" wp14:anchorId="7AB29606" wp14:editId="052B0D20">
+            <wp:simplePos x="0" y="0"/>
+            <wp:positionH relativeFrom="margin">
+              <wp:posOffset>-22464</wp:posOffset>
+            </wp:positionH>
+            <wp:positionV relativeFrom="paragraph">
+              <wp:posOffset>-692408</wp:posOffset>
+            </wp:positionV>
+            <wp:extent cx="6374373" cy="4366423"/>
+            <wp:effectExtent l="0" t="0" r="7620" b="0"/>
+            <wp:wrapNone/>
+            <wp:docPr id="5" name="Image 5"/>
+            <wp:cNvGraphicFramePr>
+              <a:graphicFrameLocks xmlns:a="http://schemas.openxmlformats.org/drawingml/2006/main" noChangeAspect="1"/>
+            </wp:cNvGraphicFramePr>
+            <a:graphic xmlns:a="http://schemas.openxmlformats.org/drawingml/2006/main">
+              <a:graphicData uri="http://schemas.openxmlformats.org/drawingml/2006/picture">
+                <pic:pic xmlns:pic="http://schemas.openxmlformats.org/drawingml/2006/picture">
+                  <pic:nvPicPr>
+                    <pic:cNvPr id="1" name=""/>
+                    <pic:cNvPicPr/>
+                  </pic:nvPicPr>
+                  <pic:blipFill>
+                    <a:blip r:embed="rId13" cstate="print">
+                      <a:extLst>
+                        <a:ext uri="{28A0092B-C50C-407E-A947-70E740481C1C}">
+                          <a14:useLocalDpi xmlns:a14="http://schemas.microsoft.com/office/drawing/2010/main" val="0"/>
+                        </a:ext>
+                      </a:extLst>
+                    </a:blip>
+                    <a:stretch>
+                      <a:fillRect/>
+                    </a:stretch>
+                  </pic:blipFill>
+                  <pic:spPr>
+                    <a:xfrm>
+                      <a:off x="0" y="0"/>
+                      <a:ext cx="6408584" cy="4389858"/>
+                    </a:xfrm>
+                    <a:prstGeom prst="rect">
+                      <a:avLst/>
+                    </a:prstGeom>
+                  </pic:spPr>
+                </pic:pic>
+              </a:graphicData>
+            </a:graphic>
+            <wp14:sizeRelH relativeFrom="margin">
+              <wp14:pctWidth>0</wp14:pctWidth>
+            </wp14:sizeRelH>
+            <wp14:sizeRelV relativeFrom="margin">
+              <wp14:pctHeight>0</wp14:pctHeight>
+            </wp14:sizeRelV>
+          </wp:anchor>
+        </w:drawing>
+      </w:r>
+    </w:p>
+    <w:p>
+      <w:pPr>
+        <w:rPr>
+          <w:b/>
+          <w:bCs/>
+        </w:rPr>
+      </w:pPr>
+    </w:p>
+    <w:p>
+      <w:pPr>
+        <w:rPr>
+          <w:b/>
+          <w:bCs/>
+        </w:rPr>
+      </w:pPr>
+    </w:p>
+    <w:p>
+      <w:pPr>
+        <w:rPr>
+          <w:b/>
+          <w:bCs/>
+        </w:rPr>
+      </w:pPr>
+    </w:p>
+    <w:p>
+      <w:pPr>
+        <w:rPr>
+          <w:b/>
+          <w:bCs/>
+        </w:rPr>
+      </w:pPr>
+    </w:p>
+    <w:p>
+      <w:pPr>
+        <w:rPr>
+          <w:b/>
+          <w:bCs/>
+        </w:rPr>
+      </w:pPr>
+    </w:p>
+    <w:p>
+      <w:pPr>
+        <w:rPr>
+          <w:b/>
+          <w:bCs/>
+        </w:rPr>
+      </w:pPr>
+    </w:p>
+    <w:p>
+      <w:pPr>
+        <w:rPr>
+          <w:b/>
+          <w:bCs/>
+        </w:rPr>
+      </w:pPr>
+    </w:p>
+    <w:p>
+      <w:pPr>
+        <w:rPr>
+          <w:b/>
+          <w:bCs/>
+        </w:rPr>
+      </w:pPr>
+    </w:p>
+    <w:p>
+      <w:pPr>
+        <w:rPr>
+          <w:b/>
+          <w:bCs/>
+        </w:rPr>
+      </w:pPr>
+    </w:p>
+    <w:p>
+      <w:pPr>
+        <w:rPr>
+          <w:b/>
+          <w:bCs/>
+        </w:rPr>
+      </w:pPr>
+    </w:p>
+    <w:p>
+      <w:pPr>
+        <w:rPr>
+          <w:b/>
+          <w:bCs/>
+        </w:rPr>
+      </w:pPr>
+      <w:r>
+        <w:rPr>
+          <w:noProof/>
+        </w:rPr>
+        <w:drawing>
+          <wp:anchor distT="0" distB="0" distL="114300" distR="114300" simplePos="0" relativeHeight="251664384" behindDoc="1" locked="0" layoutInCell="1" allowOverlap="1" wp14:anchorId="29BEADFE" wp14:editId="75A18753">
+            <wp:simplePos x="0" y="0"/>
+            <wp:positionH relativeFrom="margin">
+              <wp:align>left</wp:align>
+            </wp:positionH>
+            <wp:positionV relativeFrom="paragraph">
+              <wp:posOffset>142754</wp:posOffset>
+            </wp:positionV>
+            <wp:extent cx="6517082" cy="4321843"/>
+            <wp:effectExtent l="0" t="0" r="0" b="2540"/>
+            <wp:wrapNone/>
+            <wp:docPr id="6" name="Image 6"/>
+            <wp:cNvGraphicFramePr>
+              <a:graphicFrameLocks xmlns:a="http://schemas.openxmlformats.org/drawingml/2006/main" noChangeAspect="1"/>
+            </wp:cNvGraphicFramePr>
+            <a:graphic xmlns:a="http://schemas.openxmlformats.org/drawingml/2006/main">
+              <a:graphicData uri="http://schemas.openxmlformats.org/drawingml/2006/picture">
+                <pic:pic xmlns:pic="http://schemas.openxmlformats.org/drawingml/2006/picture">
+                  <pic:nvPicPr>
+                    <pic:cNvPr id="1" name=""/>
+                    <pic:cNvPicPr/>
+                  </pic:nvPicPr>
+                  <pic:blipFill>
+                    <a:blip r:embed="rId14" cstate="print">
+                      <a:extLst>
+                        <a:ext uri="{28A0092B-C50C-407E-A947-70E740481C1C}">
+                          <a14:useLocalDpi xmlns:a14="http://schemas.microsoft.com/office/drawing/2010/main" val="0"/>
+                        </a:ext>
+                      </a:extLst>
+                    </a:blip>
+                    <a:stretch>
+                      <a:fillRect/>
+                    </a:stretch>
+                  </pic:blipFill>
+                  <pic:spPr>
+                    <a:xfrm>
+                      <a:off x="0" y="0"/>
+                      <a:ext cx="6521233" cy="4324596"/>
+                    </a:xfrm>
+                    <a:prstGeom prst="rect">
+                      <a:avLst/>
+                    </a:prstGeom>
+                  </pic:spPr>
+                </pic:pic>
+              </a:graphicData>
+            </a:graphic>
+            <wp14:sizeRelH relativeFrom="margin">
+              <wp14:pctWidth>0</wp14:pctWidth>
+            </wp14:sizeRelH>
+            <wp14:sizeRelV relativeFrom="margin">
+              <wp14:pctHeight>0</wp14:pctHeight>
+            </wp14:sizeRelV>
+          </wp:anchor>
+        </w:drawing>
+      </w:r>
+    </w:p>
+    <w:p>
+      <w:pPr>
+        <w:rPr>
+          <w:b/>
+          <w:bCs/>
+        </w:rPr>
+      </w:pPr>
+    </w:p>
+    <w:p>
+      <w:pPr>
+        <w:rPr>
+          <w:b/>
+          <w:bCs/>
+        </w:rPr>
+      </w:pPr>
+    </w:p>
+    <w:p>
+      <w:pPr>
+        <w:rPr>
+          <w:b/>
+          <w:bCs/>
+        </w:rPr>
+      </w:pPr>
+    </w:p>
+    <w:p>
+      <w:pPr>
+        <w:rPr>
+          <w:b/>
+          <w:bCs/>
+        </w:rPr>
+      </w:pPr>
+    </w:p>
+    <w:p>
+      <w:pPr>
+        <w:rPr>
+          <w:b/>
+          <w:bCs/>
+        </w:rPr>
+      </w:pPr>
+    </w:p>
+    <w:p>
+      <w:pPr>
+        <w:rPr>
+          <w:b/>
+          <w:bCs/>
+        </w:rPr>
+      </w:pPr>
+    </w:p>
+    <w:p>
+      <w:pPr>
+        <w:rPr>
+          <w:b/>
+          <w:bCs/>
+        </w:rPr>
+      </w:pPr>
+    </w:p>
+    <w:p>
+      <w:pPr>
+        <w:rPr>
+          <w:b/>
+          <w:bCs/>
+        </w:rPr>
+      </w:pPr>
+    </w:p>
+    <w:p>
+      <w:pPr>
+        <w:rPr>
+          <w:b/>
+          <w:bCs/>
+        </w:rPr>
+      </w:pPr>
+    </w:p>
+    <w:p>
+      <w:pPr>
+        <w:rPr>
+          <w:b/>
+          <w:bCs/>
+        </w:rPr>
+      </w:pPr>
+    </w:p>
+    <w:p>
+      <w:pPr>
+        <w:rPr>
+          <w:b/>
+          <w:bCs/>
+        </w:rPr>
+      </w:pPr>
+    </w:p>
+    <w:p>
+      <w:pPr>
+        <w:rPr>
+          <w:b/>
+          <w:bCs/>
+        </w:rPr>
+      </w:pPr>
+    </w:p>
+    <w:p>
+      <w:pPr>
+        <w:rPr>
+          <w:b/>
+          <w:bCs/>
+        </w:rPr>
+      </w:pPr>
+    </w:p>
+    <w:p>
+      <w:pPr>
+        <w:rPr>
+          <w:b/>
+          <w:bCs/>
+        </w:rPr>
+      </w:pPr>
+    </w:p>
+    <w:p>
+      <w:pPr>
+        <w:rPr>
+          <w:b/>
+          <w:bCs/>
+        </w:rPr>
+      </w:pPr>
+    </w:p>
+    <w:p>
+      <w:pPr>
+        <w:rPr>
+          <w:b/>
+          <w:bCs/>
+        </w:rPr>
+      </w:pPr>
+      <w:r>
+        <w:rPr>
+          <w:noProof/>
+        </w:rPr>
+        <w:lastRenderedPageBreak/>
+        <w:drawing>
+          <wp:anchor distT="0" distB="0" distL="114300" distR="114300" simplePos="0" relativeHeight="251667456" behindDoc="1" locked="0" layoutInCell="1" allowOverlap="1" wp14:anchorId="0D4757C9" wp14:editId="3CA1871F">
+            <wp:simplePos x="0" y="0"/>
+            <wp:positionH relativeFrom="column">
+              <wp:posOffset>30392</wp:posOffset>
+            </wp:positionH>
+            <wp:positionV relativeFrom="paragraph">
+              <wp:posOffset>-687121</wp:posOffset>
+            </wp:positionV>
+            <wp:extent cx="6025526" cy="4312017"/>
+            <wp:effectExtent l="0" t="0" r="0" b="0"/>
+            <wp:wrapNone/>
+            <wp:docPr id="7" name="Image 7"/>
+            <wp:cNvGraphicFramePr>
+              <a:graphicFrameLocks xmlns:a="http://schemas.openxmlformats.org/drawingml/2006/main" noChangeAspect="1"/>
+            </wp:cNvGraphicFramePr>
+            <a:graphic xmlns:a="http://schemas.openxmlformats.org/drawingml/2006/main">
+              <a:graphicData uri="http://schemas.openxmlformats.org/drawingml/2006/picture">
+                <pic:pic xmlns:pic="http://schemas.openxmlformats.org/drawingml/2006/picture">
+                  <pic:nvPicPr>
+                    <pic:cNvPr id="1" name=""/>
+                    <pic:cNvPicPr/>
+                  </pic:nvPicPr>
+                  <pic:blipFill>
+                    <a:blip r:embed="rId15" cstate="print">
+                      <a:extLst>
+                        <a:ext uri="{28A0092B-C50C-407E-A947-70E740481C1C}">
+                          <a14:useLocalDpi xmlns:a14="http://schemas.microsoft.com/office/drawing/2010/main" val="0"/>
+                        </a:ext>
+                      </a:extLst>
+                    </a:blip>
+                    <a:stretch>
+                      <a:fillRect/>
+                    </a:stretch>
+                  </pic:blipFill>
+                  <pic:spPr>
+                    <a:xfrm>
+                      <a:off x="0" y="0"/>
+                      <a:ext cx="6042363" cy="4324066"/>
+                    </a:xfrm>
+                    <a:prstGeom prst="rect">
+                      <a:avLst/>
+                    </a:prstGeom>
+                  </pic:spPr>
+                </pic:pic>
+              </a:graphicData>
+            </a:graphic>
+            <wp14:sizeRelH relativeFrom="margin">
+              <wp14:pctWidth>0</wp14:pctWidth>
+            </wp14:sizeRelH>
+            <wp14:sizeRelV relativeFrom="margin">
+              <wp14:pctHeight>0</wp14:pctHeight>
+            </wp14:sizeRelV>
+          </wp:anchor>
+        </w:drawing>
+      </w:r>
+    </w:p>
+    <w:p>
+      <w:pPr>
+        <w:rPr>
+          <w:b/>
+          <w:bCs/>
+        </w:rPr>
+      </w:pPr>
+    </w:p>
+    <w:p>
+      <w:pPr>
+        <w:rPr>
+          <w:b/>
+          <w:bCs/>
+        </w:rPr>
+      </w:pPr>
+    </w:p>
+    <w:p>
+      <w:pPr>
+        <w:rPr>
+          <w:b/>
+          <w:bCs/>
+        </w:rPr>
+      </w:pPr>
+    </w:p>
+    <w:p>
+      <w:pPr>
+        <w:rPr>
+          <w:b/>
+          <w:bCs/>
+        </w:rPr>
+      </w:pPr>
+    </w:p>
+    <w:p>
+      <w:pPr>
+        <w:rPr>
+          <w:b/>
+          <w:bCs/>
+        </w:rPr>
+      </w:pPr>
+    </w:p>
+    <w:p>
+      <w:pPr>
+        <w:jc w:val="center"/>
+        <w:rPr>
+          <w:b/>
+          <w:bCs/>
+        </w:rPr>
+      </w:pPr>
+    </w:p>
+    <w:p>
+      <w:pPr>
+        <w:jc w:val="center"/>
+        <w:rPr>
+          <w:b/>
+          <w:bCs/>
+        </w:rPr>
+      </w:pPr>
+    </w:p>
+    <w:p>
+      <w:pPr>
+        <w:rPr>
+          <w:b/>
+          <w:bCs/>
+        </w:rPr>
+      </w:pPr>
+    </w:p>
+    <w:p>
+      <w:pPr>
+        <w:rPr>
+          <w:b/>
+          <w:bCs/>
+        </w:rPr>
+      </w:pPr>
+    </w:p>
+    <w:p>
+      <w:pPr>
+        <w:rPr>
+          <w:b/>
+          <w:bCs/>
+        </w:rPr>
+      </w:pPr>
+    </w:p>
+    <w:p>
+      <w:pPr>
+        <w:rPr>
+          <w:b/>
+          <w:bCs/>
+        </w:rPr>
+      </w:pPr>
+    </w:p>
+    <w:p>
+      <w:pPr>
+        <w:rPr>
+          <w:b/>
+          <w:bCs/>
+        </w:rPr>
+      </w:pPr>
+      <w:r>
+        <w:rPr>
+          <w:noProof/>
+        </w:rPr>
+        <w:drawing>
+          <wp:anchor distT="0" distB="0" distL="114300" distR="114300" simplePos="0" relativeHeight="251665408" behindDoc="1" locked="0" layoutInCell="1" allowOverlap="1" wp14:anchorId="2458FABF" wp14:editId="6051CAD9">
+            <wp:simplePos x="0" y="0"/>
+            <wp:positionH relativeFrom="margin">
+              <wp:posOffset>167816</wp:posOffset>
+            </wp:positionH>
+            <wp:positionV relativeFrom="paragraph">
+              <wp:posOffset>33824</wp:posOffset>
+            </wp:positionV>
+            <wp:extent cx="5782391" cy="4547870"/>
+            <wp:effectExtent l="0" t="0" r="8890" b="5080"/>
+            <wp:wrapNone/>
+            <wp:docPr id="8" name="Image 8"/>
+            <wp:cNvGraphicFramePr>
+              <a:graphicFrameLocks xmlns:a="http://schemas.openxmlformats.org/drawingml/2006/main" noChangeAspect="1"/>
+            </wp:cNvGraphicFramePr>
+            <a:graphic xmlns:a="http://schemas.openxmlformats.org/drawingml/2006/main">
+              <a:graphicData uri="http://schemas.openxmlformats.org/drawingml/2006/picture">
+                <pic:pic xmlns:pic="http://schemas.openxmlformats.org/drawingml/2006/picture">
+                  <pic:nvPicPr>
+                    <pic:cNvPr id="1" name=""/>
+                    <pic:cNvPicPr/>
+                  </pic:nvPicPr>
+                  <pic:blipFill>
+                    <a:blip r:embed="rId16" cstate="print">
+                      <a:extLst>
+                        <a:ext uri="{28A0092B-C50C-407E-A947-70E740481C1C}">
+                          <a14:useLocalDpi xmlns:a14="http://schemas.microsoft.com/office/drawing/2010/main" val="0"/>
+                        </a:ext>
+                      </a:extLst>
+                    </a:blip>
+                    <a:stretch>
+                      <a:fillRect/>
+                    </a:stretch>
+                  </pic:blipFill>
+                  <pic:spPr>
+                    <a:xfrm>
+                      <a:off x="0" y="0"/>
+                      <a:ext cx="5788116" cy="4552373"/>
+                    </a:xfrm>
+                    <a:prstGeom prst="rect">
+                      <a:avLst/>
+                    </a:prstGeom>
+                  </pic:spPr>
+                </pic:pic>
+              </a:graphicData>
+            </a:graphic>
+            <wp14:sizeRelH relativeFrom="margin">
+              <wp14:pctWidth>0</wp14:pctWidth>
+            </wp14:sizeRelH>
+            <wp14:sizeRelV relativeFrom="margin">
+              <wp14:pctHeight>0</wp14:pctHeight>
+            </wp14:sizeRelV>
+          </wp:anchor>
+        </w:drawing>
+      </w:r>
+    </w:p>
+    <w:p>
+      <w:pPr>
+        <w:rPr>
+          <w:b/>
+          <w:bCs/>
+        </w:rPr>
+      </w:pPr>
+    </w:p>
+    <w:p>
+      <w:pPr>
+        <w:rPr>
+          <w:b/>
+          <w:bCs/>
+        </w:rPr>
+      </w:pPr>
+    </w:p>
+    <w:p>
+      <w:pPr>
+        <w:rPr>
+          <w:b/>
+          <w:bCs/>
+        </w:rPr>
+      </w:pPr>
+    </w:p>
+    <w:p>
+      <w:pPr>
+        <w:rPr>
+          <w:b/>
+          <w:bCs/>
+        </w:rPr>
+      </w:pPr>
+    </w:p>
+    <w:p>
+      <w:pPr>
+        <w:rPr>
+          <w:b/>
+          <w:bCs/>
+        </w:rPr>
+      </w:pPr>
+    </w:p>
+    <w:p>
+      <w:pPr>
+        <w:rPr>
+          <w:b/>
+          <w:bCs/>
+        </w:rPr>
+      </w:pPr>
+    </w:p>
+    <w:p>
+      <w:pPr>
+        <w:rPr>
+          <w:b/>
+          <w:bCs/>
+        </w:rPr>
+      </w:pPr>
+    </w:p>
+    <w:p>
+      <w:pPr>
+        <w:rPr>
+          <w:b/>
+          <w:bCs/>
+        </w:rPr>
+      </w:pPr>
+    </w:p>
+    <w:p>
+      <w:pPr>
+        <w:rPr>
+          <w:b/>
+          <w:bCs/>
+        </w:rPr>
+      </w:pPr>
+    </w:p>
+    <w:p>
+      <w:pPr>
+        <w:rPr>
+          <w:b/>
+          <w:bCs/>
+        </w:rPr>
+      </w:pPr>
+    </w:p>
+    <w:p>
+      <w:pPr>
+        <w:rPr>
+          <w:b/>
+          <w:bCs/>
+        </w:rPr>
+      </w:pPr>
+    </w:p>
+    <w:p>
+      <w:pPr>
+        <w:rPr>
+          <w:b/>
+          <w:bCs/>
+        </w:rPr>
+      </w:pPr>
+    </w:p>
+    <w:p>
+      <w:pPr>
+        <w:rPr>
+          <w:b/>
+          <w:bCs/>
+        </w:rPr>
+      </w:pPr>
+    </w:p>
+    <w:p>
+      <w:pPr>
+        <w:rPr>
+          <w:b/>
+          <w:bCs/>
+        </w:rPr>
+      </w:pPr>
+    </w:p>
+    <w:p>
+      <w:pPr>
+        <w:rPr>
+          <w:b/>
+          <w:bCs/>
+        </w:rPr>
+      </w:pPr>
+      <w:r>
+        <w:rPr>
+          <w:noProof/>
+        </w:rPr>
+        <w:lastRenderedPageBreak/>
+        <w:drawing>
+          <wp:anchor distT="0" distB="0" distL="114300" distR="114300" simplePos="0" relativeHeight="251666432" behindDoc="1" locked="0" layoutInCell="1" allowOverlap="1" wp14:anchorId="21687CEC" wp14:editId="1B4C000F">
+            <wp:simplePos x="0" y="0"/>
+            <wp:positionH relativeFrom="margin">
+              <wp:posOffset>231242</wp:posOffset>
+            </wp:positionH>
+            <wp:positionV relativeFrom="paragraph">
+              <wp:posOffset>-724120</wp:posOffset>
+            </wp:positionV>
+            <wp:extent cx="5750677" cy="4429486"/>
+            <wp:effectExtent l="0" t="0" r="2540" b="9525"/>
+            <wp:wrapNone/>
+            <wp:docPr id="9" name="Image 9"/>
+            <wp:cNvGraphicFramePr>
+              <a:graphicFrameLocks xmlns:a="http://schemas.openxmlformats.org/drawingml/2006/main" noChangeAspect="1"/>
+            </wp:cNvGraphicFramePr>
+            <a:graphic xmlns:a="http://schemas.openxmlformats.org/drawingml/2006/main">
+              <a:graphicData uri="http://schemas.openxmlformats.org/drawingml/2006/picture">
+                <pic:pic xmlns:pic="http://schemas.openxmlformats.org/drawingml/2006/picture">
+                  <pic:nvPicPr>
+                    <pic:cNvPr id="1" name=""/>
+                    <pic:cNvPicPr/>
+                  </pic:nvPicPr>
+                  <pic:blipFill>
+                    <a:blip r:embed="rId17" cstate="print">
+                      <a:extLst>
+                        <a:ext uri="{28A0092B-C50C-407E-A947-70E740481C1C}">
+                          <a14:useLocalDpi xmlns:a14="http://schemas.microsoft.com/office/drawing/2010/main" val="0"/>
+                        </a:ext>
+                      </a:extLst>
+                    </a:blip>
+                    <a:stretch>
+                      <a:fillRect/>
+                    </a:stretch>
+                  </pic:blipFill>
+                  <pic:spPr>
+                    <a:xfrm>
+                      <a:off x="0" y="0"/>
+                      <a:ext cx="5763571" cy="4439418"/>
+                    </a:xfrm>
+                    <a:prstGeom prst="rect">
+                      <a:avLst/>
+                    </a:prstGeom>
+                  </pic:spPr>
+                </pic:pic>
+              </a:graphicData>
+            </a:graphic>
+            <wp14:sizeRelH relativeFrom="margin">
+              <wp14:pctWidth>0</wp14:pctWidth>
+            </wp14:sizeRelH>
+            <wp14:sizeRelV relativeFrom="margin">
+              <wp14:pctHeight>0</wp14:pctHeight>
+            </wp14:sizeRelV>
+          </wp:anchor>
+        </w:drawing>
+      </w:r>
+    </w:p>
+    <w:p>
+      <w:pPr>
+        <w:rPr>
+          <w:b/>
+          <w:bCs/>
+        </w:rPr>
+      </w:pPr>
+    </w:p>
+    <w:p>
+      <w:pPr>
+        <w:rPr>
+          <w:b/>
+          <w:bCs/>
+        </w:rPr>
+      </w:pPr>
+    </w:p>
+    <w:p>
+      <w:pPr>
+        <w:rPr>
+          <w:b/>
+          <w:bCs/>
+        </w:rPr>
+      </w:pPr>
+    </w:p>
+    <w:p>
+      <w:pPr>
+        <w:rPr>
+          <w:b/>
+          <w:bCs/>
+        </w:rPr>
+      </w:pPr>
+    </w:p>
+    <w:p>
+      <w:pPr>
+        <w:rPr>
+          <w:b/>
+          <w:bCs/>
+        </w:rPr>
+      </w:pPr>
+    </w:p>
+    <w:p>
+      <w:pPr>
+        <w:rPr>
+          <w:b/>
+          <w:bCs/>
+        </w:rPr>
+      </w:pPr>
+    </w:p>
+    <w:p>
+      <w:pPr>
+        <w:rPr>
+          <w:b/>
+          <w:bCs/>
+        </w:rPr>
+      </w:pPr>
+    </w:p>
+    <w:p>
+      <w:pPr>
+        <w:rPr>
+          <w:b/>
+          <w:bCs/>
+        </w:rPr>
+      </w:pPr>
+    </w:p>
+    <w:p>
+      <w:pPr>
+        <w:rPr>
+          <w:b/>
+          <w:bCs/>
+        </w:rPr>
+      </w:pPr>
     </w:p>
     <w:p>
       <w:pPr>
         <w:pStyle w:val="Titre1"/>
       </w:pPr>
-      <w:bookmarkStart w:id="3" w:name="_Toc221873853"/>
-      <w:r>
-        <w:t>Maquettes</w:t>
-      </w:r>
-      <w:bookmarkEnd w:id="3"/>
-    </w:p>
-    <w:p>
-      <w:pPr>
-        <w:rPr>
-          <w:b/>
-          <w:bCs/>
-        </w:rPr>
-      </w:pPr>
-    </w:p>
-    <w:p>
-      <w:pPr>
-        <w:rPr>
-          <w:b/>
-          <w:bCs/>
-        </w:rPr>
-      </w:pPr>
-    </w:p>
-    <w:p>
-      <w:pPr>
-        <w:rPr>
-          <w:b/>
-          <w:bCs/>
-        </w:rPr>
-      </w:pPr>
-    </w:p>
-    <w:p>
-      <w:pPr>
-        <w:rPr>
-          <w:b/>
-          <w:bCs/>
-        </w:rPr>
-      </w:pPr>
-    </w:p>
-    <w:p>
-      <w:pPr>
-        <w:rPr>
-          <w:b/>
-          <w:bCs/>
-        </w:rPr>
-      </w:pPr>
-    </w:p>
-    <w:p>
-      <w:pPr>
-        <w:rPr>
-          <w:b/>
-          <w:bCs/>
-        </w:rPr>
-      </w:pPr>
-    </w:p>
-    <w:p>
-      <w:pPr>
-        <w:rPr>
-          <w:b/>
-          <w:bCs/>
-        </w:rPr>
-      </w:pPr>
-    </w:p>
-    <w:p>
-      <w:pPr>
-        <w:rPr>
-          <w:b/>
-          <w:bCs/>
-        </w:rPr>
-      </w:pPr>
-    </w:p>
-    <w:p>
-      <w:pPr>
-        <w:rPr>
-          <w:b/>
-          <w:bCs/>
-        </w:rPr>
-      </w:pPr>
-    </w:p>
-    <w:p>
-      <w:pPr>
-        <w:rPr>
-          <w:b/>
-          <w:bCs/>
-        </w:rPr>
-      </w:pPr>
-    </w:p>
-    <w:p>
-      <w:pPr>
-        <w:rPr>
-          <w:b/>
-          <w:bCs/>
-        </w:rPr>
-      </w:pPr>
+      <w:bookmarkStart w:id="4" w:name="_Toc221873854"/>
+    </w:p>
+    <w:p/>
+    <w:p>
+      <w:pPr>
+        <w:rPr>
+          <w:rFonts w:asciiTheme="majorHAnsi" w:eastAsiaTheme="majorEastAsia" w:hAnsiTheme="majorHAnsi" w:cstheme="majorBidi"/>
+          <w:color w:val="0F4761" w:themeColor="accent1" w:themeShade="BF"/>
+          <w:sz w:val="40"/>
+          <w:szCs w:val="40"/>
+        </w:rPr>
+      </w:pPr>
+      <w:r>
+        <w:br w:type="page"/>
+      </w:r>
     </w:p>
     <w:p>
       <w:pPr>
         <w:pStyle w:val="Titre1"/>
       </w:pPr>
-      <w:bookmarkStart w:id="4" w:name="_Toc221873854"/>
-      <w:r>
+      <w:r>
+        <w:lastRenderedPageBreak/>
         <w:t>Éléments de conception</w:t>
       </w:r>
       <w:bookmarkEnd w:id="4"/>
@@ -1877,21 +3093,23 @@
       <w:r>
         <w:t xml:space="preserve">Dans la classe </w:t>
       </w:r>
-      <w:proofErr w:type="spellStart"/>
-      <w:r>
+      <w:r>
+        <w:rPr>
+          <w:i/>
+        </w:rPr>
         <w:t>BeliefPiece</w:t>
       </w:r>
-      <w:proofErr w:type="spellEnd"/>
       <w:r>
         <w:t xml:space="preserve">, la variable </w:t>
       </w:r>
-      <w:proofErr w:type="spellStart"/>
-      <w:r>
-        <w:t>probabilities</w:t>
-      </w:r>
-      <w:proofErr w:type="spellEnd"/>
-      <w:r>
-        <w:t xml:space="preserve"> sera sous la forme d</w:t>
+      <w:r>
+        <w:rPr>
+          <w:i/>
+        </w:rPr>
+        <w:t xml:space="preserve">probabilities </w:t>
+      </w:r>
+      <w:r>
+        <w:t>sera sous la forme d</w:t>
       </w:r>
       <w:r>
         <w:t>’</w:t>
@@ -1918,15 +3136,7 @@
         <w:t>)</w:t>
       </w:r>
       <w:r>
-        <w:t xml:space="preserve"> et les valeurs seront de type </w:t>
-      </w:r>
-      <w:proofErr w:type="spellStart"/>
-      <w:r>
-        <w:t>float</w:t>
-      </w:r>
-      <w:proofErr w:type="spellEnd"/>
-      <w:r>
-        <w:t xml:space="preserve">, comprises entre 0 et 1 et représentant la probabilité que la pièce donnée </w:t>
+        <w:t xml:space="preserve"> et les valeurs seront de type float, comprises entre 0 et 1 et représentant la probabilité que la pièce donnée </w:t>
       </w:r>
       <w:r>
         <w:t>corresponde au type défini par la clé</w:t>
@@ -1953,15 +3163,7 @@
         <w:t>I</w:t>
       </w:r>
       <w:r>
-        <w:t>A de conserver un État de Croyance (</w:t>
-      </w:r>
-      <w:proofErr w:type="spellStart"/>
-      <w:r>
-        <w:t>Belief</w:t>
-      </w:r>
-      <w:proofErr w:type="spellEnd"/>
-      <w:r>
-        <w:t xml:space="preserve"> </w:t>
+        <w:t xml:space="preserve">A de conserver un État de Croyance (Belief </w:t>
       </w:r>
       <w:r>
         <w:t>State) persistant</w:t>
@@ -1988,7 +3190,6 @@
         <w:t>’</w:t>
       </w:r>
       <w:r>
-        <w:lastRenderedPageBreak/>
         <w:t>i</w:t>
       </w:r>
       <w:r>
@@ -2098,7 +3299,6 @@
         </w:rPr>
       </w:pPr>
       <w:bookmarkStart w:id="10" w:name="_Toc221873860"/>
-      <w:proofErr w:type="spellStart"/>
       <w:r>
         <w:rPr>
           <w:sz w:val="28"/>
@@ -2106,7 +3306,8 @@
         </w:rPr>
         <w:t>Factory</w:t>
       </w:r>
-      <w:proofErr w:type="spellEnd"/>
+      <w:bookmarkStart w:id="11" w:name="_GoBack"/>
+      <w:bookmarkEnd w:id="11"/>
       <w:r>
         <w:rPr>
           <w:sz w:val="28"/>
@@ -2159,7 +3360,7 @@
           <w:szCs w:val="28"/>
         </w:rPr>
       </w:pPr>
-      <w:bookmarkStart w:id="11" w:name="_Toc221873861"/>
+      <w:bookmarkStart w:id="12" w:name="_Toc221873861"/>
       <w:r>
         <w:rPr>
           <w:sz w:val="28"/>
@@ -2167,7 +3368,7 @@
         </w:rPr>
         <w:t>Observer</w:t>
       </w:r>
-      <w:bookmarkEnd w:id="11"/>
+      <w:bookmarkEnd w:id="12"/>
     </w:p>
     <w:p>
       <w:pPr>
@@ -2183,15 +3384,7 @@
         <w:t>’</w:t>
       </w:r>
       <w:r>
-        <w:t xml:space="preserve">utilisation de </w:t>
-      </w:r>
-      <w:proofErr w:type="spellStart"/>
-      <w:r>
-        <w:t>useEffect</w:t>
-      </w:r>
-      <w:proofErr w:type="spellEnd"/>
-      <w:r>
-        <w:t xml:space="preserve"> dans le cadre du changement de tour de jeu correspond à un patron Observer. </w:t>
+        <w:t xml:space="preserve">utilisation de useEffect dans le cadre du changement de tour de jeu correspond à un patron Observer. </w:t>
       </w:r>
       <w:r>
         <w:t>Après un mouvement validé de la part d</w:t>
@@ -2203,21 +3396,17 @@
         <w:t>un joueur, le serveur notifie les joueurs du changement de tour</w:t>
       </w:r>
       <w:r>
-        <w:t>. La variable qui contient le tour en cours correspond au sujet observé du patron et notifie</w:t>
+        <w:t xml:space="preserve">. La variable qui contient le tour en cours correspond au sujet observé du patron </w:t>
+      </w:r>
+      <w:r>
+        <w:lastRenderedPageBreak/>
+        <w:t>et notifie</w:t>
       </w:r>
       <w:r>
         <w:t xml:space="preserve"> </w:t>
       </w:r>
       <w:r>
-        <w:t xml:space="preserve">le </w:t>
-      </w:r>
-      <w:proofErr w:type="spellStart"/>
-      <w:r>
-        <w:t>useEffect</w:t>
-      </w:r>
-      <w:proofErr w:type="spellEnd"/>
-      <w:r>
-        <w:t xml:space="preserve"> qui a cette variable comme dépendance. Celui-ci est abonné à ce sujet. Il effectue une comparaison avec la valeur précédente; si elle a </w:t>
+        <w:t xml:space="preserve">le useEffect qui a cette variable comme dépendance. Celui-ci est abonné à ce sujet. Il effectue une comparaison avec la valeur précédente; si elle a </w:t>
       </w:r>
       <w:r>
         <w:rPr>
@@ -2263,7 +3452,7 @@
           <w:szCs w:val="28"/>
         </w:rPr>
       </w:pPr>
-      <w:bookmarkStart w:id="12" w:name="_Toc221873862"/>
+      <w:bookmarkStart w:id="13" w:name="_Toc221873862"/>
       <w:r>
         <w:rPr>
           <w:sz w:val="28"/>
@@ -2271,7 +3460,7 @@
         </w:rPr>
         <w:t>MVC</w:t>
       </w:r>
-      <w:bookmarkEnd w:id="12"/>
+      <w:bookmarkEnd w:id="13"/>
       <w:r>
         <w:rPr>
           <w:sz w:val="28"/>
@@ -2358,179 +3547,172 @@
       <w:pPr>
         <w:pStyle w:val="Titre1"/>
       </w:pPr>
-      <w:bookmarkStart w:id="13" w:name="_Toc221873863"/>
+      <w:bookmarkStart w:id="14" w:name="_Toc221873863"/>
+      <w:r>
+        <w:t>Intégration individuelle</w:t>
+      </w:r>
+      <w:bookmarkEnd w:id="14"/>
+    </w:p>
+    <w:p>
+      <w:pPr>
+        <w:pStyle w:val="Titre2"/>
+        <w:rPr>
+          <w:u w:val="single"/>
+        </w:rPr>
+      </w:pPr>
+      <w:r>
+        <w:rPr>
+          <w:u w:val="single"/>
+        </w:rPr>
+        <w:t xml:space="preserve">Choix et implémentation de </w:t>
+      </w:r>
+      <w:proofErr w:type="spellStart"/>
+      <w:r>
+        <w:rPr>
+          <w:u w:val="single"/>
+        </w:rPr>
+        <w:t>React</w:t>
+      </w:r>
+      <w:proofErr w:type="spellEnd"/>
+    </w:p>
+    <w:p/>
+    <w:p>
+      <w:pPr>
+        <w:jc w:val="both"/>
+      </w:pPr>
+      <w:r>
+        <w:t xml:space="preserve">L’interface utilisateur de ce projet sera développée avec </w:t>
+      </w:r>
+      <w:proofErr w:type="spellStart"/>
+      <w:r>
+        <w:t>React</w:t>
+      </w:r>
+      <w:proofErr w:type="spellEnd"/>
+      <w:r>
+        <w:t xml:space="preserve">, une bibliothèque JavaScript idéale pour créer des applications interactives. Dans un jeu comme </w:t>
+      </w:r>
+      <w:proofErr w:type="spellStart"/>
+      <w:r>
+        <w:t>Stratego</w:t>
+      </w:r>
+      <w:proofErr w:type="spellEnd"/>
+      <w:r>
+        <w:t>, les informations évoluent constamment (déplacement d’un pion, écoulement du temps, capture d’une pièce, etc.). Avec du JavaScript classique, le navigateur devrait redessiner toute la page à chaque changement d’état, ce qui pourrait causer des ralentissements.</w:t>
+      </w:r>
+    </w:p>
+    <w:p>
+      <w:pPr>
+        <w:jc w:val="both"/>
+      </w:pPr>
+      <w:proofErr w:type="spellStart"/>
+      <w:r>
+        <w:t>React</w:t>
+      </w:r>
+      <w:proofErr w:type="spellEnd"/>
+      <w:r>
+        <w:t xml:space="preserve"> utilise un DOM virtuel : il détecte précisément ce qui a changé et ne met à jour que l’élément concerné, comme le déplacement d'une seule pièce sur le plateau. Cela garantit que le jeu reste fluide, même lors d'actions rapides.</w:t>
+      </w:r>
+    </w:p>
+    <w:p>
+      <w:pPr>
+        <w:jc w:val="both"/>
+      </w:pPr>
+      <w:r>
+        <w:t xml:space="preserve">De plus, au lieu d’avoir un </w:t>
+      </w:r>
+      <w:r>
+        <w:t xml:space="preserve">seul </w:t>
+      </w:r>
+      <w:r>
+        <w:t xml:space="preserve">bloc de code massif, </w:t>
+      </w:r>
+      <w:proofErr w:type="spellStart"/>
+      <w:r>
+        <w:t>React</w:t>
+      </w:r>
+      <w:proofErr w:type="spellEnd"/>
+      <w:r>
+        <w:t xml:space="preserve"> permet de diviser l’interface en petites pièces indépendantes : les composants (le plateau, les pièces, le score, etc.). Ainsi, pour modifier l’apparence des pions, il suffit de changer un seul fichier sans affecter le reste du système. Cette approche rend le projet beaucoup plus facile à construire, à tester et à faire évoluer</w:t>
+      </w:r>
+      <w:r>
+        <w:t xml:space="preserve"> dans l’avenir.</w:t>
+      </w:r>
+    </w:p>
+    <w:p/>
+    <w:p>
+      <w:pPr>
+        <w:pStyle w:val="Titre2"/>
+        <w:rPr>
+          <w:u w:val="single"/>
+        </w:rPr>
+      </w:pPr>
+      <w:r>
+        <w:rPr>
+          <w:u w:val="single"/>
+        </w:rPr>
+        <w:t xml:space="preserve">Choix et implémentation de </w:t>
+      </w:r>
+      <w:r>
+        <w:rPr>
+          <w:u w:val="single"/>
+        </w:rPr>
+        <w:t>l’algorithme MCTS</w:t>
+      </w:r>
+    </w:p>
+    <w:p>
+      <w:pPr>
+        <w:jc w:val="both"/>
+      </w:pPr>
+      <w:r>
+        <w:t xml:space="preserve">Les joueurs auront l’option de jouer contre une intelligence artificielle en temps réel. L’implémentation de cette IA sera basée sur l’algorithme Monte Carlo </w:t>
+      </w:r>
+      <w:proofErr w:type="spellStart"/>
+      <w:r>
+        <w:t>Tree</w:t>
+      </w:r>
+      <w:proofErr w:type="spellEnd"/>
+      <w:r>
+        <w:t xml:space="preserve"> </w:t>
+      </w:r>
+      <w:proofErr w:type="spellStart"/>
+      <w:r>
+        <w:t>Search</w:t>
+      </w:r>
+      <w:proofErr w:type="spellEnd"/>
+      <w:r>
+        <w:t xml:space="preserve"> (MCTS), puisqu’il peut retourner un résultat sans faire une évaluation exhaustive de l’espace de recherche. Comme il </w:t>
+      </w:r>
       <w:r>
         <w:lastRenderedPageBreak/>
-        <w:t>Intégration individuelle</w:t>
-      </w:r>
-      <w:bookmarkEnd w:id="13"/>
-    </w:p>
-    <w:p>
-      <w:pPr>
-        <w:pStyle w:val="Titre2"/>
-        <w:rPr>
-          <w:u w:val="single"/>
-        </w:rPr>
-      </w:pPr>
-      <w:r>
-        <w:rPr>
-          <w:u w:val="single"/>
-        </w:rPr>
-        <w:t xml:space="preserve">Choix et implémentation de </w:t>
+        <w:t xml:space="preserve">existe un nombre énorme de positions de possible au </w:t>
       </w:r>
       <w:proofErr w:type="spellStart"/>
       <w:r>
-        <w:rPr>
-          <w:u w:val="single"/>
-        </w:rPr>
-        <w:t>React</w:t>
+        <w:t>Stratego</w:t>
       </w:r>
       <w:proofErr w:type="spellEnd"/>
-    </w:p>
-    <w:p/>
+      <w:r>
+        <w:t xml:space="preserve">, cet algorithme est plus rapide et plus performant que d’autres algorithmes, ce qui le rend particulièrement adapté pour le jeu. </w:t>
+      </w:r>
+    </w:p>
     <w:p>
       <w:pPr>
         <w:jc w:val="both"/>
       </w:pPr>
       <w:r>
-        <w:t xml:space="preserve">L’interface utilisateur de ce projet sera développée avec </w:t>
-      </w:r>
-      <w:proofErr w:type="spellStart"/>
-      <w:r>
-        <w:t>React</w:t>
-      </w:r>
-      <w:proofErr w:type="spellEnd"/>
-      <w:r>
-        <w:t xml:space="preserve">, une bibliothèque JavaScript idéale pour créer des applications interactives. Dans un jeu comme </w:t>
-      </w:r>
-      <w:proofErr w:type="spellStart"/>
-      <w:r>
-        <w:t>Stratego</w:t>
-      </w:r>
-      <w:proofErr w:type="spellEnd"/>
-      <w:r>
-        <w:t>, les informations évoluent constamment (déplacement d’un pion, écoulement du temps, capture d’une pièce, etc.). Avec du JavaScript classique, le navigateur devrait redessiner toute la page à chaque changement d’état, ce qui pourrait causer des ralentissements.</w:t>
+        <w:t xml:space="preserve">Ces attributs s’expliquent grâce à la mécanique d’exploration/exploitation. L’IA peut rapidement déterminer quelles branches (mouvements) de son arbre de recherche sont les plus intéressantes et se concentrer sur celles-ci. Il évite ainsi de perdre du temps sur des mouvements qui ne lui rapporteront rien et peut donc se concentrer à évaluer les conséquences possibles de mouvements compétitifs. </w:t>
       </w:r>
     </w:p>
     <w:p>
       <w:pPr>
         <w:jc w:val="both"/>
       </w:pPr>
-      <w:proofErr w:type="spellStart"/>
-      <w:r>
-        <w:t>React</w:t>
-      </w:r>
-      <w:proofErr w:type="spellEnd"/>
-      <w:r>
-        <w:t xml:space="preserve"> utilise un DOM virtuel : il détecte précisément ce qui a changé et ne met à jour que l’élément concerné, comme le déplacement d'une seule pièce sur le plateau. Cela garantit que le jeu reste fluide, même lors d'actions rapides.</w:t>
-      </w:r>
-    </w:p>
-    <w:p>
-      <w:pPr>
-        <w:jc w:val="both"/>
-      </w:pPr>
-      <w:r>
-        <w:t xml:space="preserve">De plus, au lieu d’avoir un </w:t>
-      </w:r>
-      <w:r>
-        <w:t xml:space="preserve">seul </w:t>
-      </w:r>
-      <w:r>
-        <w:t xml:space="preserve">bloc de code massif, </w:t>
-      </w:r>
-      <w:proofErr w:type="spellStart"/>
-      <w:r>
-        <w:t>React</w:t>
-      </w:r>
-      <w:proofErr w:type="spellEnd"/>
-      <w:r>
-        <w:t xml:space="preserve"> permet de diviser l’interface en petites pièces indépendantes : les composants (le plateau, les pièces, le score, etc.). Ainsi, pour modifier l’apparence des pions, il suffit de changer un seul fichier sans affecter le reste du système. Cette approche rend le projet beaucoup plus facile à construire, à tester et à faire évoluer</w:t>
-      </w:r>
-      <w:r>
-        <w:t xml:space="preserve"> dans l’avenir.</w:t>
-      </w:r>
-    </w:p>
-    <w:p/>
-    <w:p>
-      <w:pPr>
-        <w:pStyle w:val="Titre2"/>
-        <w:rPr>
-          <w:u w:val="single"/>
-        </w:rPr>
-      </w:pPr>
-      <w:r>
-        <w:rPr>
-          <w:u w:val="single"/>
-        </w:rPr>
-        <w:t xml:space="preserve">Choix et implémentation de </w:t>
-      </w:r>
-      <w:r>
-        <w:rPr>
-          <w:u w:val="single"/>
-        </w:rPr>
-        <w:t>l’algorithme MCTS</w:t>
-      </w:r>
-      <w:bookmarkStart w:id="14" w:name="_GoBack"/>
-      <w:bookmarkEnd w:id="14"/>
-    </w:p>
-    <w:p>
-      <w:pPr>
-        <w:jc w:val="both"/>
-      </w:pPr>
-      <w:r>
-        <w:t xml:space="preserve">Les joueurs auront l’option de jouer contre une intelligence artificielle en temps réel. L’implémentation de cette IA sera basée sur l’algorithme Monte Carlo </w:t>
-      </w:r>
-      <w:proofErr w:type="spellStart"/>
-      <w:r>
-        <w:t>Tree</w:t>
-      </w:r>
-      <w:proofErr w:type="spellEnd"/>
-      <w:r>
-        <w:t xml:space="preserve"> </w:t>
-      </w:r>
-      <w:proofErr w:type="spellStart"/>
-      <w:r>
-        <w:t>Search</w:t>
-      </w:r>
-      <w:proofErr w:type="spellEnd"/>
-      <w:r>
-        <w:t xml:space="preserve"> (MCTS), puisqu’il peut retourner un résultat sans faire une évaluation exhaustive de l’espace de recherche. Comme il existe un nombre énorme de positions de possible au </w:t>
-      </w:r>
-      <w:proofErr w:type="spellStart"/>
-      <w:r>
-        <w:t>Stratego</w:t>
-      </w:r>
-      <w:proofErr w:type="spellEnd"/>
-      <w:r>
-        <w:t xml:space="preserve">, cet algorithme est plus rapide et plus performant que d’autres algorithmes, ce qui le rend particulièrement adapté pour le jeu. </w:t>
-      </w:r>
-    </w:p>
-    <w:p>
-      <w:pPr>
-        <w:jc w:val="both"/>
-      </w:pPr>
-      <w:r>
-        <w:t xml:space="preserve">Ces attributs s’expliquent grâce à la mécanique d’exploration/exploitation. L’IA peut rapidement déterminer quelles branches (mouvements) de son arbre de recherche sont les plus intéressantes et se concentrer sur celles-ci. Il évite ainsi de perdre du temps sur des mouvements qui ne lui rapporteront rien et peut donc se concentrer à évaluer les conséquences possibles de mouvements compétitifs. </w:t>
-      </w:r>
-    </w:p>
-    <w:p>
-      <w:pPr>
-        <w:jc w:val="both"/>
-      </w:pPr>
-      <w:r>
-        <w:t xml:space="preserve">Pour permettre à l’algorithme de faire ses recherches dans un jeu à information imparfaite (l’identité des pièces ennemies n’est pas connue avant l’issue d’un combat), l’algorithme sera accompagné de </w:t>
-      </w:r>
-      <w:proofErr w:type="spellStart"/>
-      <w:r>
-        <w:t>Belief</w:t>
-      </w:r>
-      <w:proofErr w:type="spellEnd"/>
-      <w:r>
-        <w:t xml:space="preserve"> States (BS). Ceux-ci lui permettront de conserver en mémoire les hypothèses quant au placement des pièces de l’adversaire. Ces hypothèses seront basées sur les mouvements observés des pièces, sur l’issue des combats, ainsi que sur le nombre de pièces en jeu de chaque type de pièce, et seront mises à jour après chaque tour. L’IA utilisera ces BS pour peaufiner ses stratégies et ses mouvements.</w:t>
+      <w:r>
+        <w:t>Pour permettre à l’algorithme de faire ses recherches dans un jeu à information imparfaite (l’identité des pièces ennemies n’est pas connue avant l’issue d’un combat), l’algorithme sera accompagné de Belief States (BS). Ceux-ci lui permettront de conserver en mémoire les hypothèses quant au placement des pièces de l’adversaire. Ces hypothèses seront basées sur les mouvements observés des pièces, sur l’issue des combats, ainsi que sur le nombre de pièces en jeu de chaque type de pièce, et seront mises à jour après chaque tour. L’IA utilisera ces BS pour peaufiner ses stratégies et ses mouvements.</w:t>
       </w:r>
     </w:p>
     <w:sectPr>
-      <w:footerReference w:type="default" r:id="rId9"/>
+      <w:footerReference w:type="default" r:id="rId18"/>
       <w:pgSz w:w="12240" w:h="15840"/>
       <w:pgMar w:top="1440" w:right="1800" w:bottom="1440" w:left="1800" w:header="708" w:footer="708" w:gutter="0"/>
       <w:cols w:space="708"/>
@@ -4392,7 +5574,7 @@
 </file>
 
 <file path=customXml/itemProps1.xml><?xml version="1.0" encoding="utf-8"?>
-<ds:datastoreItem xmlns:ds="http://schemas.openxmlformats.org/officeDocument/2006/customXml" ds:itemID="{D584F657-F613-48E9-881C-5AC11F5DC14C}">
+<ds:datastoreItem xmlns:ds="http://schemas.openxmlformats.org/officeDocument/2006/customXml" ds:itemID="{F7F94FC4-2D29-4406-A8A9-61D7CD8B45BA}">
   <ds:schemaRefs>
     <ds:schemaRef ds:uri="http://schemas.openxmlformats.org/officeDocument/2006/bibliography"/>
   </ds:schemaRefs>

</xml_diff>

<commit_message>
Mise a jour diagramme de classe
</commit_message>
<xml_diff>
--- a/doc/C61_-_Document de conception_L_Attaque.docx
+++ b/doc/C61_-_Document de conception_L_Attaque.docx
@@ -373,6 +373,9 @@
         <w:p>
           <w:pPr>
             <w:pStyle w:val="En-ttedetabledesmatires"/>
+            <w:rPr>
+              <w:lang w:val="fr-FR"/>
+            </w:rPr>
           </w:pPr>
           <w:r>
             <w:rPr>
@@ -380,6 +383,20 @@
             </w:rPr>
             <w:t>Table des matières</w:t>
           </w:r>
+        </w:p>
+        <w:p>
+          <w:pPr>
+            <w:rPr>
+              <w:lang w:val="fr-FR"/>
+            </w:rPr>
+          </w:pPr>
+        </w:p>
+        <w:p>
+          <w:pPr>
+            <w:rPr>
+              <w:lang w:val="fr-FR"/>
+            </w:rPr>
+          </w:pPr>
         </w:p>
         <w:p>
           <w:pPr>
@@ -525,7 +542,7 @@
                 <w:noProof/>
                 <w:webHidden/>
               </w:rPr>
-              <w:t>3</w:t>
+              <w:t>4</w:t>
             </w:r>
             <w:r>
               <w:rPr>
@@ -598,7 +615,7 @@
                 <w:noProof/>
                 <w:webHidden/>
               </w:rPr>
-              <w:t>3</w:t>
+              <w:t>5</w:t>
             </w:r>
             <w:r>
               <w:rPr>
@@ -671,7 +688,7 @@
                 <w:noProof/>
                 <w:webHidden/>
               </w:rPr>
-              <w:t>3</w:t>
+              <w:t>7</w:t>
             </w:r>
             <w:r>
               <w:rPr>
@@ -744,7 +761,7 @@
                 <w:noProof/>
                 <w:webHidden/>
               </w:rPr>
-              <w:t>3</w:t>
+              <w:t>12</w:t>
             </w:r>
             <w:r>
               <w:rPr>
@@ -817,7 +834,7 @@
                 <w:noProof/>
                 <w:webHidden/>
               </w:rPr>
-              <w:t>3</w:t>
+              <w:t>12</w:t>
             </w:r>
             <w:r>
               <w:rPr>
@@ -890,7 +907,7 @@
                 <w:noProof/>
                 <w:webHidden/>
               </w:rPr>
-              <w:t>3</w:t>
+              <w:t>12</w:t>
             </w:r>
             <w:r>
               <w:rPr>
@@ -963,7 +980,7 @@
                 <w:noProof/>
                 <w:webHidden/>
               </w:rPr>
-              <w:t>4</w:t>
+              <w:t>12</w:t>
             </w:r>
             <w:r>
               <w:rPr>
@@ -1036,7 +1053,7 @@
                 <w:noProof/>
                 <w:webHidden/>
               </w:rPr>
-              <w:t>4</w:t>
+              <w:t>12</w:t>
             </w:r>
             <w:r>
               <w:rPr>
@@ -1109,7 +1126,7 @@
                 <w:noProof/>
                 <w:webHidden/>
               </w:rPr>
-              <w:t>4</w:t>
+              <w:t>12</w:t>
             </w:r>
             <w:r>
               <w:rPr>
@@ -1182,7 +1199,7 @@
                 <w:noProof/>
                 <w:webHidden/>
               </w:rPr>
-              <w:t>4</w:t>
+              <w:t>12</w:t>
             </w:r>
             <w:r>
               <w:rPr>
@@ -1255,7 +1272,7 @@
                 <w:noProof/>
                 <w:webHidden/>
               </w:rPr>
-              <w:t>4</w:t>
+              <w:t>12</w:t>
             </w:r>
             <w:r>
               <w:rPr>
@@ -1328,7 +1345,7 @@
                 <w:noProof/>
                 <w:webHidden/>
               </w:rPr>
-              <w:t>5</w:t>
+              <w:t>13</w:t>
             </w:r>
             <w:r>
               <w:rPr>
@@ -1401,7 +1418,7 @@
                 <w:noProof/>
                 <w:webHidden/>
               </w:rPr>
-              <w:t>5</w:t>
+              <w:t>13</w:t>
             </w:r>
             <w:r>
               <w:rPr>
@@ -1577,17 +1594,74 @@
       <w:pPr>
         <w:pStyle w:val="Titre1"/>
       </w:pPr>
-    </w:p>
-    <w:p>
-      <w:pPr>
-        <w:pStyle w:val="Titre1"/>
-      </w:pPr>
       <w:bookmarkStart w:id="1" w:name="_Toc221873851"/>
       <w:r>
+        <w:rPr>
+          <w:noProof/>
+        </w:rPr>
+        <w:lastRenderedPageBreak/>
+        <w:drawing>
+          <wp:anchor distT="0" distB="0" distL="114300" distR="114300" simplePos="0" relativeHeight="251657215" behindDoc="1" locked="0" layoutInCell="1" allowOverlap="1" wp14:anchorId="34E2FCE9" wp14:editId="288C8BCB">
+            <wp:simplePos x="0" y="0"/>
+            <wp:positionH relativeFrom="margin">
+              <wp:posOffset>-736013</wp:posOffset>
+            </wp:positionH>
+            <wp:positionV relativeFrom="paragraph">
+              <wp:posOffset>311847</wp:posOffset>
+            </wp:positionV>
+            <wp:extent cx="7157882" cy="8217719"/>
+            <wp:effectExtent l="0" t="0" r="5080" b="0"/>
+            <wp:wrapNone/>
+            <wp:docPr id="11" name="Image 11"/>
+            <wp:cNvGraphicFramePr>
+              <a:graphicFrameLocks xmlns:a="http://schemas.openxmlformats.org/drawingml/2006/main" noChangeAspect="1"/>
+            </wp:cNvGraphicFramePr>
+            <a:graphic xmlns:a="http://schemas.openxmlformats.org/drawingml/2006/main">
+              <a:graphicData uri="http://schemas.openxmlformats.org/drawingml/2006/picture">
+                <pic:pic xmlns:pic="http://schemas.openxmlformats.org/drawingml/2006/picture">
+                  <pic:nvPicPr>
+                    <pic:cNvPr id="1" name=""/>
+                    <pic:cNvPicPr/>
+                  </pic:nvPicPr>
+                  <pic:blipFill>
+                    <a:blip r:embed="rId8">
+                      <a:extLst>
+                        <a:ext uri="{28A0092B-C50C-407E-A947-70E740481C1C}">
+                          <a14:useLocalDpi xmlns:a14="http://schemas.microsoft.com/office/drawing/2010/main" val="0"/>
+                        </a:ext>
+                      </a:extLst>
+                    </a:blip>
+                    <a:stretch>
+                      <a:fillRect/>
+                    </a:stretch>
+                  </pic:blipFill>
+                  <pic:spPr>
+                    <a:xfrm>
+                      <a:off x="0" y="0"/>
+                      <a:ext cx="7171503" cy="8233357"/>
+                    </a:xfrm>
+                    <a:prstGeom prst="rect">
+                      <a:avLst/>
+                    </a:prstGeom>
+                  </pic:spPr>
+                </pic:pic>
+              </a:graphicData>
+            </a:graphic>
+            <wp14:sizeRelH relativeFrom="margin">
+              <wp14:pctWidth>0</wp14:pctWidth>
+            </wp14:sizeRelH>
+            <wp14:sizeRelV relativeFrom="margin">
+              <wp14:pctHeight>0</wp14:pctHeight>
+            </wp14:sizeRelV>
+          </wp:anchor>
+        </w:drawing>
+      </w:r>
+      <w:r>
         <w:t>Diagramme de classes</w:t>
       </w:r>
       <w:bookmarkEnd w:id="1"/>
     </w:p>
+    <w:p/>
     <w:p>
       <w:pPr>
         <w:rPr>
@@ -1597,15 +1671,146 @@
           <w:szCs w:val="40"/>
         </w:rPr>
       </w:pPr>
-      <w:r>
-        <w:br w:type="page"/>
-      </w:r>
     </w:p>
     <w:p>
       <w:pPr>
         <w:pStyle w:val="Titre1"/>
       </w:pPr>
       <w:bookmarkStart w:id="2" w:name="_Toc221873852"/>
+    </w:p>
+    <w:p>
+      <w:pPr>
+        <w:pStyle w:val="Titre1"/>
+      </w:pPr>
+      <w:r>
+        <w:rPr>
+          <w:noProof/>
+        </w:rPr>
+        <w:drawing>
+          <wp:anchor distT="0" distB="0" distL="114300" distR="114300" simplePos="0" relativeHeight="251668480" behindDoc="1" locked="0" layoutInCell="1" allowOverlap="1" wp14:anchorId="20193DB1" wp14:editId="6D50D467">
+            <wp:simplePos x="0" y="0"/>
+            <wp:positionH relativeFrom="column">
+              <wp:posOffset>-1321</wp:posOffset>
+            </wp:positionH>
+            <wp:positionV relativeFrom="paragraph">
+              <wp:posOffset>-360680</wp:posOffset>
+            </wp:positionV>
+            <wp:extent cx="6360586" cy="8493510"/>
+            <wp:effectExtent l="0" t="0" r="2540" b="3175"/>
+            <wp:wrapNone/>
+            <wp:docPr id="13" name="Image 13"/>
+            <wp:cNvGraphicFramePr>
+              <a:graphicFrameLocks xmlns:a="http://schemas.openxmlformats.org/drawingml/2006/main" noChangeAspect="1"/>
+            </wp:cNvGraphicFramePr>
+            <a:graphic xmlns:a="http://schemas.openxmlformats.org/drawingml/2006/main">
+              <a:graphicData uri="http://schemas.openxmlformats.org/drawingml/2006/picture">
+                <pic:pic xmlns:pic="http://schemas.openxmlformats.org/drawingml/2006/picture">
+                  <pic:nvPicPr>
+                    <pic:cNvPr id="1" name=""/>
+                    <pic:cNvPicPr/>
+                  </pic:nvPicPr>
+                  <pic:blipFill>
+                    <a:blip r:embed="rId9">
+                      <a:extLst>
+                        <a:ext uri="{28A0092B-C50C-407E-A947-70E740481C1C}">
+                          <a14:useLocalDpi xmlns:a14="http://schemas.microsoft.com/office/drawing/2010/main" val="0"/>
+                        </a:ext>
+                      </a:extLst>
+                    </a:blip>
+                    <a:stretch>
+                      <a:fillRect/>
+                    </a:stretch>
+                  </pic:blipFill>
+                  <pic:spPr>
+                    <a:xfrm>
+                      <a:off x="0" y="0"/>
+                      <a:ext cx="6360586" cy="8493510"/>
+                    </a:xfrm>
+                    <a:prstGeom prst="rect">
+                      <a:avLst/>
+                    </a:prstGeom>
+                  </pic:spPr>
+                </pic:pic>
+              </a:graphicData>
+            </a:graphic>
+          </wp:anchor>
+        </w:drawing>
+      </w:r>
+    </w:p>
+    <w:p>
+      <w:pPr>
+        <w:pStyle w:val="Titre1"/>
+      </w:pPr>
+    </w:p>
+    <w:p>
+      <w:pPr>
+        <w:pStyle w:val="Titre1"/>
+      </w:pPr>
+    </w:p>
+    <w:p>
+      <w:pPr>
+        <w:pStyle w:val="Titre1"/>
+      </w:pPr>
+    </w:p>
+    <w:p>
+      <w:pPr>
+        <w:pStyle w:val="Titre1"/>
+      </w:pPr>
+    </w:p>
+    <w:p>
+      <w:pPr>
+        <w:pStyle w:val="Titre1"/>
+      </w:pPr>
+    </w:p>
+    <w:p>
+      <w:pPr>
+        <w:pStyle w:val="Titre1"/>
+      </w:pPr>
+    </w:p>
+    <w:p>
+      <w:pPr>
+        <w:pStyle w:val="Titre1"/>
+      </w:pPr>
+    </w:p>
+    <w:p>
+      <w:pPr>
+        <w:pStyle w:val="Titre1"/>
+      </w:pPr>
+    </w:p>
+    <w:p>
+      <w:pPr>
+        <w:pStyle w:val="Titre1"/>
+      </w:pPr>
+    </w:p>
+    <w:p>
+      <w:pPr>
+        <w:pStyle w:val="Titre1"/>
+      </w:pPr>
+    </w:p>
+    <w:p>
+      <w:pPr>
+        <w:pStyle w:val="Titre1"/>
+      </w:pPr>
+    </w:p>
+    <w:p>
+      <w:pPr>
+        <w:pStyle w:val="Titre1"/>
+      </w:pPr>
+    </w:p>
+    <w:p>
+      <w:pPr>
+        <w:pStyle w:val="Titre1"/>
+      </w:pPr>
+    </w:p>
+    <w:p>
+      <w:pPr>
+        <w:pStyle w:val="Titre1"/>
+      </w:pPr>
+    </w:p>
+    <w:p>
+      <w:pPr>
+        <w:pStyle w:val="Titre1"/>
+      </w:pPr>
       <w:r>
         <w:lastRenderedPageBreak/>
         <w:t>Modèle relationnel</w:t>
@@ -1643,7 +1848,7 @@
                     <pic:cNvPicPr/>
                   </pic:nvPicPr>
                   <pic:blipFill>
-                    <a:blip r:embed="rId8" cstate="print">
+                    <a:blip r:embed="rId10" cstate="print">
                       <a:extLst>
                         <a:ext uri="{28A0092B-C50C-407E-A947-70E740481C1C}">
                           <a14:useLocalDpi xmlns:a14="http://schemas.microsoft.com/office/drawing/2010/main" val="0"/>
@@ -1717,7 +1922,7 @@
                     <pic:cNvPicPr/>
                   </pic:nvPicPr>
                   <pic:blipFill>
-                    <a:blip r:embed="rId9" cstate="print">
+                    <a:blip r:embed="rId11" cstate="print">
                       <a:extLst>
                         <a:ext uri="{28A0092B-C50C-407E-A947-70E740481C1C}">
                           <a14:useLocalDpi xmlns:a14="http://schemas.microsoft.com/office/drawing/2010/main" val="0"/>
@@ -1795,7 +2000,7 @@
                     <pic:cNvPicPr/>
                   </pic:nvPicPr>
                   <pic:blipFill>
-                    <a:blip r:embed="rId10" cstate="print">
+                    <a:blip r:embed="rId12" cstate="print">
                       <a:extLst>
                         <a:ext uri="{28A0092B-C50C-407E-A947-70E740481C1C}">
                           <a14:useLocalDpi xmlns:a14="http://schemas.microsoft.com/office/drawing/2010/main" val="0"/>
@@ -1871,7 +2076,7 @@
                     <pic:cNvPicPr/>
                   </pic:nvPicPr>
                   <pic:blipFill>
-                    <a:blip r:embed="rId11" cstate="print">
+                    <a:blip r:embed="rId13" cstate="print">
                       <a:extLst>
                         <a:ext uri="{28A0092B-C50C-407E-A947-70E740481C1C}">
                           <a14:useLocalDpi xmlns:a14="http://schemas.microsoft.com/office/drawing/2010/main" val="0"/>
@@ -2020,7 +2225,7 @@
                     <pic:cNvPicPr/>
                   </pic:nvPicPr>
                   <pic:blipFill>
-                    <a:blip r:embed="rId12" cstate="print">
+                    <a:blip r:embed="rId14" cstate="print">
                       <a:extLst>
                         <a:ext uri="{28A0092B-C50C-407E-A947-70E740481C1C}">
                           <a14:useLocalDpi xmlns:a14="http://schemas.microsoft.com/office/drawing/2010/main" val="0"/>
@@ -2201,7 +2406,7 @@
                     <pic:cNvPicPr/>
                   </pic:nvPicPr>
                   <pic:blipFill>
-                    <a:blip r:embed="rId13" cstate="print">
+                    <a:blip r:embed="rId15" cstate="print">
                       <a:extLst>
                         <a:ext uri="{28A0092B-C50C-407E-A947-70E740481C1C}">
                           <a14:useLocalDpi xmlns:a14="http://schemas.microsoft.com/office/drawing/2010/main" val="0"/>
@@ -2349,7 +2554,7 @@
                     <pic:cNvPicPr/>
                   </pic:nvPicPr>
                   <pic:blipFill>
-                    <a:blip r:embed="rId14" cstate="print">
+                    <a:blip r:embed="rId16" cstate="print">
                       <a:extLst>
                         <a:ext uri="{28A0092B-C50C-407E-A947-70E740481C1C}">
                           <a14:useLocalDpi xmlns:a14="http://schemas.microsoft.com/office/drawing/2010/main" val="0"/>
@@ -2538,7 +2743,7 @@
                     <pic:cNvPicPr/>
                   </pic:nvPicPr>
                   <pic:blipFill>
-                    <a:blip r:embed="rId15" cstate="print">
+                    <a:blip r:embed="rId17" cstate="print">
                       <a:extLst>
                         <a:ext uri="{28A0092B-C50C-407E-A947-70E740481C1C}">
                           <a14:useLocalDpi xmlns:a14="http://schemas.microsoft.com/office/drawing/2010/main" val="0"/>
@@ -2696,7 +2901,7 @@
                     <pic:cNvPicPr/>
                   </pic:nvPicPr>
                   <pic:blipFill>
-                    <a:blip r:embed="rId16" cstate="print">
+                    <a:blip r:embed="rId18" cstate="print">
                       <a:extLst>
                         <a:ext uri="{28A0092B-C50C-407E-A947-70E740481C1C}">
                           <a14:useLocalDpi xmlns:a14="http://schemas.microsoft.com/office/drawing/2010/main" val="0"/>
@@ -2877,7 +3082,7 @@
                     <pic:cNvPicPr/>
                   </pic:nvPicPr>
                   <pic:blipFill>
-                    <a:blip r:embed="rId17" cstate="print">
+                    <a:blip r:embed="rId19" cstate="print">
                       <a:extLst>
                         <a:ext uri="{28A0092B-C50C-407E-A947-70E740481C1C}">
                           <a14:useLocalDpi xmlns:a14="http://schemas.microsoft.com/office/drawing/2010/main" val="0"/>
@@ -3304,417 +3509,416 @@
           <w:sz w:val="28"/>
           <w:szCs w:val="28"/>
         </w:rPr>
-        <w:t>Factory</w:t>
-      </w:r>
-      <w:bookmarkStart w:id="11" w:name="_GoBack"/>
-      <w:bookmarkEnd w:id="11"/>
-      <w:r>
+        <w:t>Factory Pattern</w:t>
+      </w:r>
+      <w:bookmarkEnd w:id="10"/>
+    </w:p>
+    <w:p>
+      <w:pPr>
+        <w:jc w:val="both"/>
+      </w:pPr>
+      <w:r>
+        <w:t>Ce patron</w:t>
+      </w:r>
+      <w:r>
+        <w:t xml:space="preserve"> de conception permet </w:t>
+      </w:r>
+      <w:r>
+        <w:t>d’</w:t>
+      </w:r>
+      <w:r>
+        <w:t>ajouter facilement différents thèmes graphiques aux pièces sans avoir à coder 12 classes de façon indépendante. Il permet de réduire la complexité du code (</w:t>
+      </w:r>
+      <w:r>
+        <w:t>réduire les branchements conditionnels</w:t>
+      </w:r>
+      <w:r>
+        <w:t>)</w:t>
+      </w:r>
+      <w:r>
+        <w:t xml:space="preserve"> </w:t>
+      </w:r>
+      <w:r>
+        <w:t>en centralisant la logique commune dans une fonction usine. Il permet donc de séparer la logique de l</w:t>
+      </w:r>
+      <w:r>
+        <w:t>’</w:t>
+      </w:r>
+      <w:r>
+        <w:t xml:space="preserve">apparence des pièces, ce qui est intéressant dans un jeu où les pièces ont différentes apparences, mais des logiques similaires. </w:t>
+      </w:r>
+    </w:p>
+    <w:p>
+      <w:pPr>
+        <w:pStyle w:val="Titre3"/>
         <w:rPr>
           <w:sz w:val="28"/>
           <w:szCs w:val="28"/>
         </w:rPr>
-        <w:t xml:space="preserve"> Pattern</w:t>
-      </w:r>
-      <w:bookmarkEnd w:id="10"/>
-    </w:p>
-    <w:p>
-      <w:pPr>
-        <w:jc w:val="both"/>
-      </w:pPr>
-      <w:r>
-        <w:t>Ce patron</w:t>
-      </w:r>
-      <w:r>
-        <w:t xml:space="preserve"> de conception permet </w:t>
-      </w:r>
-      <w:r>
-        <w:t>d’</w:t>
-      </w:r>
-      <w:r>
-        <w:t>ajouter facilement différents thèmes graphiques aux pièces sans avoir à coder 12 classes de façon indépendante. Il permet de réduire la complexité du code (</w:t>
-      </w:r>
-      <w:r>
-        <w:t>réduire les branchements conditionnels</w:t>
-      </w:r>
-      <w:r>
-        <w:t>)</w:t>
-      </w:r>
-      <w:r>
-        <w:t xml:space="preserve"> </w:t>
-      </w:r>
-      <w:r>
-        <w:t>en centralisant la logique commune dans une fonction usine. Il permet donc de séparer la logique de l</w:t>
-      </w:r>
-      <w:r>
-        <w:t>’</w:t>
-      </w:r>
-      <w:r>
-        <w:t xml:space="preserve">apparence des pièces, ce qui est intéressant dans un jeu où les pièces ont différentes apparences, mais des logiques similaires. </w:t>
-      </w:r>
-    </w:p>
-    <w:p>
-      <w:pPr>
-        <w:pStyle w:val="Titre3"/>
+      </w:pPr>
+      <w:bookmarkStart w:id="11" w:name="_Toc221873861"/>
+      <w:r>
         <w:rPr>
           <w:sz w:val="28"/>
           <w:szCs w:val="28"/>
         </w:rPr>
-      </w:pPr>
-      <w:bookmarkStart w:id="12" w:name="_Toc221873861"/>
-      <w:r>
+        <w:t>Observer</w:t>
+      </w:r>
+      <w:bookmarkEnd w:id="11"/>
+    </w:p>
+    <w:p>
+      <w:pPr>
+        <w:jc w:val="both"/>
+        <w:rPr>
+          <w:rFonts w:ascii="Times New Roman" w:hAnsi="Times New Roman"/>
+        </w:rPr>
+      </w:pPr>
+      <w:r>
+        <w:t>L</w:t>
+      </w:r>
+      <w:r>
+        <w:t>’</w:t>
+      </w:r>
+      <w:r>
+        <w:t xml:space="preserve">utilisation de useEffect dans le cadre du changement de tour de jeu correspond à un patron Observer. </w:t>
+      </w:r>
+      <w:r>
+        <w:t>Après un mouvement validé de la part d</w:t>
+      </w:r>
+      <w:r>
+        <w:t>’</w:t>
+      </w:r>
+      <w:r>
+        <w:t>un joueur, le serveur notifie les joueurs du changement de tour</w:t>
+      </w:r>
+      <w:r>
+        <w:t xml:space="preserve">. La variable qui contient le tour en cours correspond au sujet observé du patron </w:t>
+      </w:r>
+      <w:r>
+        <w:lastRenderedPageBreak/>
+        <w:t>et notifie</w:t>
+      </w:r>
+      <w:r>
+        <w:t xml:space="preserve"> </w:t>
+      </w:r>
+      <w:r>
+        <w:t xml:space="preserve">le useEffect qui a cette variable comme dépendance. Celui-ci est abonné à ce sujet. Il effectue une comparaison avec la valeur précédente; si elle a </w:t>
+      </w:r>
+      <w:r>
+        <w:rPr>
+          <w:rFonts w:hint="eastAsia"/>
+        </w:rPr>
+        <w:t>chang</w:t>
+      </w:r>
+      <w:r>
+        <w:t>é, l</w:t>
+      </w:r>
+      <w:r>
+        <w:t>e</w:t>
+      </w:r>
+      <w:r>
+        <w:t xml:space="preserve"> comp</w:t>
+      </w:r>
+      <w:r>
+        <w:t>osant enti</w:t>
+      </w:r>
+      <w:r>
+        <w:t>er</w:t>
+      </w:r>
+      <w:r>
+        <w:t xml:space="preserve"> est rafraîchi. Ce processus s</w:t>
+      </w:r>
+      <w:r>
+        <w:t>’</w:t>
+      </w:r>
+      <w:r>
+        <w:t xml:space="preserve">effectue de manière automatique et non pas impérative. </w:t>
+      </w:r>
+    </w:p>
+    <w:p>
+      <w:pPr>
+        <w:ind w:left="708"/>
+      </w:pPr>
+    </w:p>
+    <w:p>
+      <w:pPr>
+        <w:pStyle w:val="Titre3"/>
         <w:rPr>
           <w:sz w:val="28"/>
           <w:szCs w:val="28"/>
         </w:rPr>
-        <w:t>Observer</w:t>
-      </w:r>
-      <w:bookmarkEnd w:id="12"/>
-    </w:p>
-    <w:p>
-      <w:pPr>
-        <w:jc w:val="both"/>
-        <w:rPr>
-          <w:rFonts w:ascii="Times New Roman" w:hAnsi="Times New Roman"/>
-        </w:rPr>
-      </w:pPr>
-      <w:r>
-        <w:t>L</w:t>
-      </w:r>
-      <w:r>
-        <w:t>’</w:t>
-      </w:r>
-      <w:r>
-        <w:t xml:space="preserve">utilisation de useEffect dans le cadre du changement de tour de jeu correspond à un patron Observer. </w:t>
-      </w:r>
-      <w:r>
-        <w:t>Après un mouvement validé de la part d</w:t>
-      </w:r>
-      <w:r>
-        <w:t>’</w:t>
-      </w:r>
-      <w:r>
-        <w:t>un joueur, le serveur notifie les joueurs du changement de tour</w:t>
-      </w:r>
-      <w:r>
-        <w:t xml:space="preserve">. La variable qui contient le tour en cours correspond au sujet observé du patron </w:t>
-      </w:r>
-      <w:r>
-        <w:lastRenderedPageBreak/>
-        <w:t>et notifie</w:t>
-      </w:r>
-      <w:r>
-        <w:t xml:space="preserve"> </w:t>
-      </w:r>
-      <w:r>
-        <w:t xml:space="preserve">le useEffect qui a cette variable comme dépendance. Celui-ci est abonné à ce sujet. Il effectue une comparaison avec la valeur précédente; si elle a </w:t>
-      </w:r>
-      <w:r>
-        <w:rPr>
-          <w:rFonts w:hint="eastAsia"/>
-        </w:rPr>
-        <w:t>chang</w:t>
-      </w:r>
-      <w:r>
-        <w:t>é, l</w:t>
-      </w:r>
-      <w:r>
-        <w:t>e</w:t>
-      </w:r>
-      <w:r>
-        <w:t xml:space="preserve"> comp</w:t>
-      </w:r>
-      <w:r>
-        <w:t>osant enti</w:t>
-      </w:r>
-      <w:r>
-        <w:t>er</w:t>
-      </w:r>
-      <w:r>
-        <w:t xml:space="preserve"> est rafraîchi. Ce processus s</w:t>
-      </w:r>
-      <w:r>
-        <w:t>’</w:t>
-      </w:r>
-      <w:r>
-        <w:t xml:space="preserve">effectue de manière automatique et non pas impérative. </w:t>
-      </w:r>
-    </w:p>
-    <w:p>
-      <w:pPr>
-        <w:ind w:left="708"/>
-      </w:pPr>
-    </w:p>
-    <w:p>
-      <w:pPr>
-        <w:pStyle w:val="Titre3"/>
+      </w:pPr>
+      <w:bookmarkStart w:id="12" w:name="_Toc221873862"/>
+      <w:r>
         <w:rPr>
           <w:sz w:val="28"/>
           <w:szCs w:val="28"/>
         </w:rPr>
-      </w:pPr>
-      <w:bookmarkStart w:id="13" w:name="_Toc221873862"/>
+        <w:t>MVC</w:t>
+      </w:r>
+      <w:bookmarkEnd w:id="12"/>
       <w:r>
         <w:rPr>
           <w:sz w:val="28"/>
           <w:szCs w:val="28"/>
         </w:rPr>
-        <w:t>MVC</w:t>
+        <w:t xml:space="preserve"> </w:t>
+      </w:r>
+    </w:p>
+    <w:p>
+      <w:r>
+        <w:t>Nous utiliserons l</w:t>
+      </w:r>
+      <w:r>
+        <w:t>’</w:t>
+      </w:r>
+      <w:r>
+        <w:t>architecture MVC. Le modèle, qui contiendra les données et la logique sera codé en python et sera indépendant de l</w:t>
+      </w:r>
+      <w:r>
+        <w:t>’</w:t>
+      </w:r>
+      <w:r>
+        <w:t>i</w:t>
+      </w:r>
+      <w:r>
+        <w:t>nterface utilisateur</w:t>
+      </w:r>
+      <w:r>
+        <w:rPr>
+          <w:rFonts w:hint="eastAsia"/>
+        </w:rPr>
+        <w:t> </w:t>
+      </w:r>
+      <w:r>
+        <w:t>: il sera possible de modifier les éléments du modèle sans affecter la vue. Le modèle connaîtra les règles du jeu, gérera le plateau de jeu et les attributs des joueurs et sera responsable de l</w:t>
+      </w:r>
+      <w:r>
+        <w:t>’</w:t>
+      </w:r>
+      <w:r>
+        <w:t>I</w:t>
+      </w:r>
+      <w:r>
+        <w:t xml:space="preserve">A. La vue sera codée en </w:t>
+      </w:r>
+      <w:proofErr w:type="spellStart"/>
+      <w:r>
+        <w:t>React</w:t>
+      </w:r>
+      <w:proofErr w:type="spellEnd"/>
+      <w:r>
+        <w:t xml:space="preserve"> et recevra du contrôleur uniquement ce qui lui est</w:t>
+      </w:r>
+      <w:r>
+        <w:t xml:space="preserve"> nécessaire. Elle enverra au contrôleur la disposition originale de ses pièces et ses différentes actions lors d</w:t>
+      </w:r>
+      <w:r>
+        <w:t>’</w:t>
+      </w:r>
+      <w:r>
+        <w:t>u</w:t>
+      </w:r>
+      <w:r>
+        <w:t xml:space="preserve">ne utilisation. La classe </w:t>
+      </w:r>
+      <w:r>
+        <w:t>Contrôleur</w:t>
+      </w:r>
+      <w:r>
+        <w:t xml:space="preserve"> </w:t>
+      </w:r>
+      <w:r>
+        <w:t>dans le backend agira comme tel entre le modèle et la vue. Il sera chargé d</w:t>
+      </w:r>
+      <w:r>
+        <w:t>’</w:t>
+      </w:r>
+      <w:r>
+        <w:t xml:space="preserve">acheminer les données entre les deux autres parties. </w:t>
+      </w:r>
+    </w:p>
+    <w:p/>
+    <w:p>
+      <w:pPr>
+        <w:pStyle w:val="Titre1"/>
+      </w:pPr>
+      <w:bookmarkStart w:id="13" w:name="_Toc221873863"/>
+      <w:r>
+        <w:t>Intégration individuelle</w:t>
       </w:r>
       <w:bookmarkEnd w:id="13"/>
-      <w:r>
-        <w:rPr>
-          <w:sz w:val="28"/>
-          <w:szCs w:val="28"/>
-        </w:rPr>
+    </w:p>
+    <w:p>
+      <w:pPr>
+        <w:pStyle w:val="Titre2"/>
+        <w:rPr>
+          <w:u w:val="single"/>
+        </w:rPr>
+      </w:pPr>
+      <w:r>
+        <w:rPr>
+          <w:u w:val="single"/>
+        </w:rPr>
+        <w:t xml:space="preserve">Choix et implémentation de </w:t>
+      </w:r>
+      <w:proofErr w:type="spellStart"/>
+      <w:r>
+        <w:rPr>
+          <w:u w:val="single"/>
+        </w:rPr>
+        <w:t>React</w:t>
+      </w:r>
+      <w:proofErr w:type="spellEnd"/>
+    </w:p>
+    <w:p/>
+    <w:p>
+      <w:pPr>
+        <w:jc w:val="both"/>
+      </w:pPr>
+      <w:r>
+        <w:t xml:space="preserve">L’interface utilisateur de ce projet sera développée avec </w:t>
+      </w:r>
+      <w:proofErr w:type="spellStart"/>
+      <w:r>
+        <w:t>React</w:t>
+      </w:r>
+      <w:proofErr w:type="spellEnd"/>
+      <w:r>
+        <w:t xml:space="preserve">, une bibliothèque JavaScript idéale pour créer des applications interactives. Dans un jeu </w:t>
+      </w:r>
+      <w:r>
+        <w:t>de type</w:t>
+      </w:r>
+      <w:r>
         <w:t xml:space="preserve"> </w:t>
       </w:r>
-    </w:p>
-    <w:p>
-      <w:r>
-        <w:t>Nous utiliserons l</w:t>
-      </w:r>
-      <w:r>
-        <w:t>’</w:t>
-      </w:r>
-      <w:r>
-        <w:t>architecture MVC. Le modèle, qui contiendra les données et la logique sera codé en python et sera indépendant de l</w:t>
-      </w:r>
-      <w:r>
-        <w:t>’</w:t>
-      </w:r>
-      <w:r>
-        <w:t>i</w:t>
-      </w:r>
-      <w:r>
-        <w:t>nterface utilisateur</w:t>
-      </w:r>
-      <w:r>
-        <w:rPr>
-          <w:rFonts w:hint="eastAsia"/>
-        </w:rPr>
-        <w:t> </w:t>
-      </w:r>
-      <w:r>
-        <w:t>: il sera possible de modifier les éléments du modèle sans affecter la vue. Le modèle connaîtra les règles du jeu, gérera le plateau de jeu et les attributs des joueurs et sera responsable de l</w:t>
-      </w:r>
-      <w:r>
-        <w:t>’</w:t>
-      </w:r>
-      <w:r>
-        <w:t>I</w:t>
-      </w:r>
-      <w:r>
-        <w:t xml:space="preserve">A. La vue sera codée en </w:t>
-      </w:r>
       <w:proofErr w:type="spellStart"/>
       <w:r>
+        <w:t>Stratego</w:t>
+      </w:r>
+      <w:proofErr w:type="spellEnd"/>
+      <w:r>
+        <w:t>, les informations évoluent constamment (déplacement d’un pion, écoulement du temps, capture d’une pièce, etc.). Avec du JavaScript classique, le navigateur devrait redessiner toute la page à chaque changement d’état, ce qui pourrait causer des ralentissements.</w:t>
+      </w:r>
+    </w:p>
+    <w:p>
+      <w:pPr>
+        <w:jc w:val="both"/>
+      </w:pPr>
+      <w:proofErr w:type="spellStart"/>
+      <w:r>
         <w:t>React</w:t>
       </w:r>
       <w:proofErr w:type="spellEnd"/>
       <w:r>
-        <w:t xml:space="preserve"> et recevra du contrôleur uniquement ce qui lui est</w:t>
-      </w:r>
-      <w:r>
-        <w:t xml:space="preserve"> nécessaire. Elle enverra au contrôleur la disposition originale de ses pièces et ses différentes actions lors d</w:t>
-      </w:r>
-      <w:r>
-        <w:t>’</w:t>
-      </w:r>
-      <w:r>
-        <w:t>u</w:t>
-      </w:r>
-      <w:r>
-        <w:t xml:space="preserve">ne utilisation. La classe </w:t>
-      </w:r>
-      <w:r>
-        <w:t>Contrôleur</w:t>
-      </w:r>
+        <w:t xml:space="preserve"> utilise un DOM virtuel : il détecte précisément ce qui a changé et ne met à jour que l’élément concerné, comme le déplacement d'une seule pièce sur le plateau. Cela garantit que le jeu reste fluide, même lors d'actions rapides.</w:t>
+      </w:r>
+    </w:p>
+    <w:p>
+      <w:pPr>
+        <w:jc w:val="both"/>
+      </w:pPr>
+      <w:r>
+        <w:t xml:space="preserve">De plus, au lieu d’avoir un </w:t>
+      </w:r>
+      <w:r>
+        <w:t xml:space="preserve">seul </w:t>
+      </w:r>
+      <w:r>
+        <w:t xml:space="preserve">bloc de code massif, </w:t>
+      </w:r>
+      <w:proofErr w:type="spellStart"/>
+      <w:r>
+        <w:t>React</w:t>
+      </w:r>
+      <w:proofErr w:type="spellEnd"/>
+      <w:r>
+        <w:t xml:space="preserve"> permet de diviser l’interface en petites pièces indépendantes : les composants (le plateau, les pièces, le score, etc.). Ainsi, pour modifier l’apparence des pions, il suffit de changer un seul fichier sans affecter le reste du système. Cette approche rend le projet beaucoup plus facile à construire, à tester et à faire évoluer</w:t>
+      </w:r>
+      <w:r>
+        <w:t xml:space="preserve"> dans l’avenir.</w:t>
+      </w:r>
+    </w:p>
+    <w:p/>
+    <w:p/>
+    <w:p>
+      <w:bookmarkStart w:id="14" w:name="_GoBack"/>
+      <w:bookmarkEnd w:id="14"/>
+    </w:p>
+    <w:p>
+      <w:pPr>
+        <w:pStyle w:val="Titre2"/>
+        <w:rPr>
+          <w:u w:val="single"/>
+        </w:rPr>
+      </w:pPr>
+      <w:r>
+        <w:rPr>
+          <w:u w:val="single"/>
+        </w:rPr>
+        <w:lastRenderedPageBreak/>
+        <w:t xml:space="preserve">Choix et implémentation de </w:t>
+      </w:r>
+      <w:r>
+        <w:rPr>
+          <w:u w:val="single"/>
+        </w:rPr>
+        <w:t>l’algorithme MCTS</w:t>
+      </w:r>
+    </w:p>
+    <w:p>
+      <w:pPr>
+        <w:jc w:val="both"/>
+      </w:pPr>
+      <w:r>
+        <w:t xml:space="preserve">Les joueurs auront l’option de jouer contre une intelligence artificielle en temps réel. L’implémentation de cette IA sera basée sur l’algorithme Monte Carlo </w:t>
+      </w:r>
+      <w:proofErr w:type="spellStart"/>
+      <w:r>
+        <w:t>Tree</w:t>
+      </w:r>
+      <w:proofErr w:type="spellEnd"/>
       <w:r>
         <w:t xml:space="preserve"> </w:t>
       </w:r>
-      <w:r>
-        <w:t>dans le backend agira comme tel entre le modèle et la vue. Il sera chargé d</w:t>
-      </w:r>
-      <w:r>
-        <w:t>’</w:t>
-      </w:r>
-      <w:r>
-        <w:t xml:space="preserve">acheminer les données entre les deux autres parties. </w:t>
-      </w:r>
-    </w:p>
-    <w:p/>
-    <w:p>
-      <w:pPr>
-        <w:pStyle w:val="Titre1"/>
-      </w:pPr>
-      <w:bookmarkStart w:id="14" w:name="_Toc221873863"/>
-      <w:r>
-        <w:t>Intégration individuelle</w:t>
-      </w:r>
-      <w:bookmarkEnd w:id="14"/>
-    </w:p>
-    <w:p>
-      <w:pPr>
-        <w:pStyle w:val="Titre2"/>
-        <w:rPr>
-          <w:u w:val="single"/>
-        </w:rPr>
-      </w:pPr>
-      <w:r>
-        <w:rPr>
-          <w:u w:val="single"/>
-        </w:rPr>
-        <w:t xml:space="preserve">Choix et implémentation de </w:t>
-      </w:r>
       <w:proofErr w:type="spellStart"/>
       <w:r>
-        <w:rPr>
-          <w:u w:val="single"/>
-        </w:rPr>
-        <w:t>React</w:t>
+        <w:t>Search</w:t>
       </w:r>
       <w:proofErr w:type="spellEnd"/>
-    </w:p>
-    <w:p/>
+      <w:r>
+        <w:t xml:space="preserve"> (MCTS), puisqu’il peut retourner un résultat sans faire une évaluation exhaustive de l’espace de recherche. Comme il existe un nombre énorme de positions de possible au </w:t>
+      </w:r>
+      <w:proofErr w:type="spellStart"/>
+      <w:r>
+        <w:t>Stratego</w:t>
+      </w:r>
+      <w:proofErr w:type="spellEnd"/>
+      <w:r>
+        <w:t xml:space="preserve">, cet algorithme est plus rapide et plus performant que d’autres algorithmes, ce qui le rend particulièrement adapté pour le jeu. </w:t>
+      </w:r>
+    </w:p>
     <w:p>
       <w:pPr>
         <w:jc w:val="both"/>
       </w:pPr>
       <w:r>
-        <w:t xml:space="preserve">L’interface utilisateur de ce projet sera développée avec </w:t>
-      </w:r>
-      <w:proofErr w:type="spellStart"/>
-      <w:r>
-        <w:t>React</w:t>
-      </w:r>
-      <w:proofErr w:type="spellEnd"/>
-      <w:r>
-        <w:t xml:space="preserve">, une bibliothèque JavaScript idéale pour créer des applications interactives. Dans un jeu comme </w:t>
-      </w:r>
-      <w:proofErr w:type="spellStart"/>
-      <w:r>
-        <w:t>Stratego</w:t>
-      </w:r>
-      <w:proofErr w:type="spellEnd"/>
-      <w:r>
-        <w:t>, les informations évoluent constamment (déplacement d’un pion, écoulement du temps, capture d’une pièce, etc.). Avec du JavaScript classique, le navigateur devrait redessiner toute la page à chaque changement d’état, ce qui pourrait causer des ralentissements.</w:t>
+        <w:t xml:space="preserve">Ces attributs s’expliquent grâce à la mécanique d’exploration/exploitation. L’IA peut rapidement déterminer quelles branches (mouvements) de son arbre de recherche sont les plus intéressantes et se concentrer sur celles-ci. Il évite ainsi de perdre du temps sur des mouvements qui ne lui rapporteront rien et peut donc se concentrer à évaluer les conséquences possibles de mouvements compétitifs. </w:t>
       </w:r>
     </w:p>
     <w:p>
       <w:pPr>
         <w:jc w:val="both"/>
       </w:pPr>
-      <w:proofErr w:type="spellStart"/>
-      <w:r>
-        <w:t>React</w:t>
-      </w:r>
-      <w:proofErr w:type="spellEnd"/>
-      <w:r>
-        <w:t xml:space="preserve"> utilise un DOM virtuel : il détecte précisément ce qui a changé et ne met à jour que l’élément concerné, comme le déplacement d'une seule pièce sur le plateau. Cela garantit que le jeu reste fluide, même lors d'actions rapides.</w:t>
-      </w:r>
-    </w:p>
-    <w:p>
-      <w:pPr>
-        <w:jc w:val="both"/>
-      </w:pPr>
-      <w:r>
-        <w:t xml:space="preserve">De plus, au lieu d’avoir un </w:t>
-      </w:r>
-      <w:r>
-        <w:t xml:space="preserve">seul </w:t>
-      </w:r>
-      <w:r>
-        <w:t xml:space="preserve">bloc de code massif, </w:t>
-      </w:r>
-      <w:proofErr w:type="spellStart"/>
-      <w:r>
-        <w:t>React</w:t>
-      </w:r>
-      <w:proofErr w:type="spellEnd"/>
-      <w:r>
-        <w:t xml:space="preserve"> permet de diviser l’interface en petites pièces indépendantes : les composants (le plateau, les pièces, le score, etc.). Ainsi, pour modifier l’apparence des pions, il suffit de changer un seul fichier sans affecter le reste du système. Cette approche rend le projet beaucoup plus facile à construire, à tester et à faire évoluer</w:t>
-      </w:r>
-      <w:r>
-        <w:t xml:space="preserve"> dans l’avenir.</w:t>
-      </w:r>
-    </w:p>
-    <w:p/>
-    <w:p>
-      <w:pPr>
-        <w:pStyle w:val="Titre2"/>
-        <w:rPr>
-          <w:u w:val="single"/>
-        </w:rPr>
-      </w:pPr>
-      <w:r>
-        <w:rPr>
-          <w:u w:val="single"/>
-        </w:rPr>
-        <w:t xml:space="preserve">Choix et implémentation de </w:t>
-      </w:r>
-      <w:r>
-        <w:rPr>
-          <w:u w:val="single"/>
-        </w:rPr>
-        <w:t>l’algorithme MCTS</w:t>
-      </w:r>
-    </w:p>
-    <w:p>
-      <w:pPr>
-        <w:jc w:val="both"/>
-      </w:pPr>
-      <w:r>
-        <w:t xml:space="preserve">Les joueurs auront l’option de jouer contre une intelligence artificielle en temps réel. L’implémentation de cette IA sera basée sur l’algorithme Monte Carlo </w:t>
-      </w:r>
-      <w:proofErr w:type="spellStart"/>
-      <w:r>
-        <w:t>Tree</w:t>
-      </w:r>
-      <w:proofErr w:type="spellEnd"/>
-      <w:r>
-        <w:t xml:space="preserve"> </w:t>
-      </w:r>
-      <w:proofErr w:type="spellStart"/>
-      <w:r>
-        <w:t>Search</w:t>
-      </w:r>
-      <w:proofErr w:type="spellEnd"/>
-      <w:r>
-        <w:t xml:space="preserve"> (MCTS), puisqu’il peut retourner un résultat sans faire une évaluation exhaustive de l’espace de recherche. Comme il </w:t>
-      </w:r>
-      <w:r>
-        <w:lastRenderedPageBreak/>
-        <w:t xml:space="preserve">existe un nombre énorme de positions de possible au </w:t>
-      </w:r>
-      <w:proofErr w:type="spellStart"/>
-      <w:r>
-        <w:t>Stratego</w:t>
-      </w:r>
-      <w:proofErr w:type="spellEnd"/>
-      <w:r>
-        <w:t xml:space="preserve">, cet algorithme est plus rapide et plus performant que d’autres algorithmes, ce qui le rend particulièrement adapté pour le jeu. </w:t>
-      </w:r>
-    </w:p>
-    <w:p>
-      <w:pPr>
-        <w:jc w:val="both"/>
-      </w:pPr>
-      <w:r>
-        <w:t xml:space="preserve">Ces attributs s’expliquent grâce à la mécanique d’exploration/exploitation. L’IA peut rapidement déterminer quelles branches (mouvements) de son arbre de recherche sont les plus intéressantes et se concentrer sur celles-ci. Il évite ainsi de perdre du temps sur des mouvements qui ne lui rapporteront rien et peut donc se concentrer à évaluer les conséquences possibles de mouvements compétitifs. </w:t>
-      </w:r>
-    </w:p>
-    <w:p>
-      <w:pPr>
-        <w:jc w:val="both"/>
-      </w:pPr>
       <w:r>
         <w:t>Pour permettre à l’algorithme de faire ses recherches dans un jeu à information imparfaite (l’identité des pièces ennemies n’est pas connue avant l’issue d’un combat), l’algorithme sera accompagné de Belief States (BS). Ceux-ci lui permettront de conserver en mémoire les hypothèses quant au placement des pièces de l’adversaire. Ces hypothèses seront basées sur les mouvements observés des pièces, sur l’issue des combats, ainsi que sur le nombre de pièces en jeu de chaque type de pièce, et seront mises à jour après chaque tour. L’IA utilisera ces BS pour peaufiner ses stratégies et ses mouvements.</w:t>
       </w:r>
     </w:p>
     <w:sectPr>
-      <w:footerReference w:type="default" r:id="rId18"/>
+      <w:footerReference w:type="default" r:id="rId20"/>
       <w:pgSz w:w="12240" w:h="15840"/>
-      <w:pgMar w:top="1440" w:right="1800" w:bottom="1440" w:left="1800" w:header="708" w:footer="708" w:gutter="0"/>
+      <w:pgMar w:top="1440" w:right="1800" w:bottom="1440" w:left="1800" w:header="708" w:footer="340" w:gutter="0"/>
       <w:cols w:space="708"/>
       <w:titlePg/>
       <w:docGrid w:linePitch="360"/>
@@ -5574,7 +5778,7 @@
 </file>
 
 <file path=customXml/itemProps1.xml><?xml version="1.0" encoding="utf-8"?>
-<ds:datastoreItem xmlns:ds="http://schemas.openxmlformats.org/officeDocument/2006/customXml" ds:itemID="{F7F94FC4-2D29-4406-A8A9-61D7CD8B45BA}">
+<ds:datastoreItem xmlns:ds="http://schemas.openxmlformats.org/officeDocument/2006/customXml" ds:itemID="{1C70BBD6-38FF-4874-B884-305597212409}">
   <ds:schemaRefs>
     <ds:schemaRef ds:uri="http://schemas.openxmlformats.org/officeDocument/2006/bibliography"/>
   </ds:schemaRefs>

</xml_diff>

<commit_message>
Mise a jour diagramme de classe + ajout dans document de conception
</commit_message>
<xml_diff>
--- a/doc/C61_-_Document de conception_L_Attaque.docx
+++ b/doc/C61_-_Document de conception_L_Attaque.docx
@@ -1677,26 +1677,23 @@
         <w:pStyle w:val="Titre1"/>
       </w:pPr>
       <w:bookmarkStart w:id="2" w:name="_Toc221873852"/>
-    </w:p>
-    <w:p>
-      <w:pPr>
-        <w:pStyle w:val="Titre1"/>
-      </w:pPr>
+      <w:bookmarkStart w:id="3" w:name="_GoBack"/>
       <w:r>
         <w:rPr>
           <w:noProof/>
         </w:rPr>
+        <w:lastRenderedPageBreak/>
         <w:drawing>
-          <wp:anchor distT="0" distB="0" distL="114300" distR="114300" simplePos="0" relativeHeight="251668480" behindDoc="1" locked="0" layoutInCell="1" allowOverlap="1" wp14:anchorId="20193DB1" wp14:editId="6D50D467">
+          <wp:anchor distT="0" distB="0" distL="114300" distR="114300" simplePos="0" relativeHeight="251668480" behindDoc="1" locked="0" layoutInCell="1" allowOverlap="1" wp14:anchorId="20193DB1" wp14:editId="4EDCBA55">
             <wp:simplePos x="0" y="0"/>
-            <wp:positionH relativeFrom="column">
-              <wp:posOffset>-1321</wp:posOffset>
+            <wp:positionH relativeFrom="margin">
+              <wp:align>left</wp:align>
             </wp:positionH>
             <wp:positionV relativeFrom="paragraph">
-              <wp:posOffset>-360680</wp:posOffset>
+              <wp:posOffset>0</wp:posOffset>
             </wp:positionV>
-            <wp:extent cx="6360586" cy="8493510"/>
-            <wp:effectExtent l="0" t="0" r="2540" b="3175"/>
+            <wp:extent cx="6410579" cy="8492941"/>
+            <wp:effectExtent l="0" t="0" r="0" b="3810"/>
             <wp:wrapNone/>
             <wp:docPr id="13" name="Image 13"/>
             <wp:cNvGraphicFramePr>
@@ -1724,7 +1721,7 @@
                   <pic:spPr>
                     <a:xfrm>
                       <a:off x="0" y="0"/>
-                      <a:ext cx="6360586" cy="8493510"/>
+                      <a:ext cx="6410579" cy="8492941"/>
                     </a:xfrm>
                     <a:prstGeom prst="rect">
                       <a:avLst/>
@@ -1733,9 +1730,18 @@
                 </pic:pic>
               </a:graphicData>
             </a:graphic>
+            <wp14:sizeRelH relativeFrom="margin">
+              <wp14:pctWidth>0</wp14:pctWidth>
+            </wp14:sizeRelH>
           </wp:anchor>
         </w:drawing>
       </w:r>
+      <w:bookmarkEnd w:id="3"/>
+    </w:p>
+    <w:p>
+      <w:pPr>
+        <w:pStyle w:val="Titre1"/>
+      </w:pPr>
     </w:p>
     <w:p>
       <w:pPr>
@@ -1892,7 +1898,7 @@
       <w:pPr>
         <w:pStyle w:val="Titre1"/>
       </w:pPr>
-      <w:bookmarkStart w:id="3" w:name="_Toc221873853"/>
+      <w:bookmarkStart w:id="4" w:name="_Toc221873853"/>
       <w:r>
         <w:rPr>
           <w:noProof/>
@@ -1957,7 +1963,7 @@
       <w:r>
         <w:t>Maquettes</w:t>
       </w:r>
-      <w:bookmarkEnd w:id="3"/>
+      <w:bookmarkEnd w:id="4"/>
     </w:p>
     <w:p/>
     <w:p/>
@@ -3191,7 +3197,7 @@
       <w:pPr>
         <w:pStyle w:val="Titre1"/>
       </w:pPr>
-      <w:bookmarkStart w:id="4" w:name="_Toc221873854"/>
+      <w:bookmarkStart w:id="5" w:name="_Toc221873854"/>
     </w:p>
     <w:p/>
     <w:p>
@@ -3215,7 +3221,7 @@
         <w:lastRenderedPageBreak/>
         <w:t>Éléments de conception</w:t>
       </w:r>
-      <w:bookmarkEnd w:id="4"/>
+      <w:bookmarkEnd w:id="5"/>
     </w:p>
     <w:p>
       <w:pPr>
@@ -3224,14 +3230,14 @@
           <w:u w:val="single"/>
         </w:rPr>
       </w:pPr>
-      <w:bookmarkStart w:id="5" w:name="_Toc221873855"/>
+      <w:bookmarkStart w:id="6" w:name="_Toc221873855"/>
       <w:r>
         <w:rPr>
           <w:u w:val="single"/>
         </w:rPr>
         <w:t>Structures de données</w:t>
       </w:r>
-      <w:bookmarkEnd w:id="5"/>
+      <w:bookmarkEnd w:id="6"/>
     </w:p>
     <w:p>
       <w:pPr>
@@ -3241,7 +3247,7 @@
           <w:szCs w:val="28"/>
         </w:rPr>
       </w:pPr>
-      <w:bookmarkStart w:id="6" w:name="_Toc221873856"/>
+      <w:bookmarkStart w:id="7" w:name="_Toc221873856"/>
       <w:r>
         <w:rPr>
           <w:sz w:val="28"/>
@@ -3249,7 +3255,7 @@
         </w:rPr>
         <w:t>Double liste chainée</w:t>
       </w:r>
-      <w:bookmarkEnd w:id="6"/>
+      <w:bookmarkEnd w:id="7"/>
     </w:p>
     <w:p>
       <w:pPr>
@@ -3284,7 +3290,7 @@
           <w:szCs w:val="28"/>
         </w:rPr>
       </w:pPr>
-      <w:bookmarkStart w:id="7" w:name="_Toc221873857"/>
+      <w:bookmarkStart w:id="8" w:name="_Toc221873857"/>
       <w:r>
         <w:rPr>
           <w:sz w:val="28"/>
@@ -3292,7 +3298,7 @@
         </w:rPr>
         <w:t>Dictionnaire</w:t>
       </w:r>
-      <w:bookmarkEnd w:id="7"/>
+      <w:bookmarkEnd w:id="8"/>
     </w:p>
     <w:p>
       <w:r>
@@ -3432,7 +3438,7 @@
           <w:szCs w:val="28"/>
         </w:rPr>
       </w:pPr>
-      <w:bookmarkStart w:id="8" w:name="_Toc221873858"/>
+      <w:bookmarkStart w:id="9" w:name="_Toc221873858"/>
       <w:r>
         <w:rPr>
           <w:sz w:val="28"/>
@@ -3440,7 +3446,7 @@
         </w:rPr>
         <w:t>Tableau</w:t>
       </w:r>
-      <w:bookmarkEnd w:id="8"/>
+      <w:bookmarkEnd w:id="9"/>
     </w:p>
     <w:p>
       <w:r>
@@ -3486,14 +3492,14 @@
           <w:u w:val="single"/>
         </w:rPr>
       </w:pPr>
-      <w:bookmarkStart w:id="9" w:name="_Toc221873859"/>
+      <w:bookmarkStart w:id="10" w:name="_Toc221873859"/>
       <w:r>
         <w:rPr>
           <w:u w:val="single"/>
         </w:rPr>
         <w:t>Patrons de conception</w:t>
       </w:r>
-      <w:bookmarkEnd w:id="9"/>
+      <w:bookmarkEnd w:id="10"/>
     </w:p>
     <w:p>
       <w:pPr>
@@ -3503,7 +3509,7 @@
           <w:szCs w:val="28"/>
         </w:rPr>
       </w:pPr>
-      <w:bookmarkStart w:id="10" w:name="_Toc221873860"/>
+      <w:bookmarkStart w:id="11" w:name="_Toc221873860"/>
       <w:r>
         <w:rPr>
           <w:sz w:val="28"/>
@@ -3511,7 +3517,7 @@
         </w:rPr>
         <w:t>Factory Pattern</w:t>
       </w:r>
-      <w:bookmarkEnd w:id="10"/>
+      <w:bookmarkEnd w:id="11"/>
     </w:p>
     <w:p>
       <w:pPr>
@@ -3556,7 +3562,7 @@
           <w:szCs w:val="28"/>
         </w:rPr>
       </w:pPr>
-      <w:bookmarkStart w:id="11" w:name="_Toc221873861"/>
+      <w:bookmarkStart w:id="12" w:name="_Toc221873861"/>
       <w:r>
         <w:rPr>
           <w:sz w:val="28"/>
@@ -3564,7 +3570,7 @@
         </w:rPr>
         <w:t>Observer</w:t>
       </w:r>
-      <w:bookmarkEnd w:id="11"/>
+      <w:bookmarkEnd w:id="12"/>
     </w:p>
     <w:p>
       <w:pPr>
@@ -3648,7 +3654,7 @@
           <w:szCs w:val="28"/>
         </w:rPr>
       </w:pPr>
-      <w:bookmarkStart w:id="12" w:name="_Toc221873862"/>
+      <w:bookmarkStart w:id="13" w:name="_Toc221873862"/>
       <w:r>
         <w:rPr>
           <w:sz w:val="28"/>
@@ -3656,7 +3662,7 @@
         </w:rPr>
         <w:t>MVC</w:t>
       </w:r>
-      <w:bookmarkEnd w:id="12"/>
+      <w:bookmarkEnd w:id="13"/>
       <w:r>
         <w:rPr>
           <w:sz w:val="28"/>
@@ -3743,11 +3749,11 @@
       <w:pPr>
         <w:pStyle w:val="Titre1"/>
       </w:pPr>
-      <w:bookmarkStart w:id="13" w:name="_Toc221873863"/>
+      <w:bookmarkStart w:id="14" w:name="_Toc221873863"/>
       <w:r>
         <w:t>Intégration individuelle</w:t>
       </w:r>
-      <w:bookmarkEnd w:id="13"/>
+      <w:bookmarkEnd w:id="14"/>
     </w:p>
     <w:p>
       <w:pPr>
@@ -3842,10 +3848,7 @@
     </w:p>
     <w:p/>
     <w:p/>
-    <w:p>
-      <w:bookmarkStart w:id="14" w:name="_GoBack"/>
-      <w:bookmarkEnd w:id="14"/>
-    </w:p>
+    <w:p/>
     <w:p>
       <w:pPr>
         <w:pStyle w:val="Titre2"/>
@@ -5778,7 +5781,7 @@
 </file>
 
 <file path=customXml/itemProps1.xml><?xml version="1.0" encoding="utf-8"?>
-<ds:datastoreItem xmlns:ds="http://schemas.openxmlformats.org/officeDocument/2006/customXml" ds:itemID="{1C70BBD6-38FF-4874-B884-305597212409}">
+<ds:datastoreItem xmlns:ds="http://schemas.openxmlformats.org/officeDocument/2006/customXml" ds:itemID="{33DDD9F7-92BF-46EA-B9F7-CB8596721902}">
   <ds:schemaRefs>
     <ds:schemaRef ds:uri="http://schemas.openxmlformats.org/officeDocument/2006/bibliography"/>
   </ds:schemaRefs>

</xml_diff>